<commit_message>
nmv 26 08 2026
</commit_message>
<xml_diff>
--- a/TS Jatai Ghanam Project/TS 3.5/TS 3.5 Ghanam Malayalam Corrections.docx
+++ b/TS Jatai Ghanam Project/TS 3.5/TS 3.5 Ghanam Malayalam Corrections.docx
@@ -1,6 +1,6 @@
 
 <file path=word/document.xml><?xml version="1.0" encoding="utf-8"?>
-<w:document xmlns:wpc="http://schemas.microsoft.com/office/word/2010/wordprocessingCanvas" xmlns:cx="http://schemas.microsoft.com/office/drawing/2014/chartex" xmlns:cx1="http://schemas.microsoft.com/office/drawing/2015/9/8/chartex" xmlns:cx2="http://schemas.microsoft.com/office/drawing/2015/10/21/chartex" xmlns:cx3="http://schemas.microsoft.com/office/drawing/2016/5/9/chartex" xmlns:cx4="http://schemas.microsoft.com/office/drawing/2016/5/10/chartex" xmlns:cx5="http://schemas.microsoft.com/office/drawing/2016/5/11/chartex" xmlns:cx6="http://schemas.microsoft.com/office/drawing/2016/5/12/chartex" xmlns:cx7="http://schemas.microsoft.com/office/drawing/2016/5/13/chartex" xmlns:cx8="http://schemas.microsoft.com/office/drawing/2016/5/14/chartex" xmlns:mc="http://schemas.openxmlformats.org/markup-compatibility/2006" xmlns:aink="http://schemas.microsoft.com/office/drawing/2016/ink" xmlns:am3d="http://schemas.microsoft.com/office/drawing/2017/model3d" xmlns:o="urn:schemas-microsoft-com:office:office" xmlns:oel="http://schemas.microsoft.com/office/2019/extlst" xmlns:r="http://schemas.openxmlformats.org/officeDocument/2006/relationships" xmlns:m="http://schemas.openxmlformats.org/officeDocument/2006/math" xmlns:v="urn:schemas-microsoft-com:vml" xmlns:wp14="http://schemas.microsoft.com/office/word/2010/wordprocessingDrawing" xmlns:wp="http://schemas.openxmlformats.org/drawingml/2006/wordprocessingDrawing" xmlns:w10="urn:schemas-microsoft-com:office:word" xmlns:w="http://schemas.openxmlformats.org/wordprocessingml/2006/main" xmlns:w14="http://schemas.microsoft.com/office/word/2010/wordml" xmlns:w15="http://schemas.microsoft.com/office/word/2012/wordml" xmlns:w16cex="http://schemas.microsoft.com/office/word/2018/wordml/cex" xmlns:w16cid="http://schemas.microsoft.com/office/word/2016/wordml/cid" xmlns:w16="http://schemas.microsoft.com/office/word/2018/wordml" xmlns:w16sdtdh="http://schemas.microsoft.com/office/word/2020/wordml/sdtdatahash" xmlns:w16se="http://schemas.microsoft.com/office/word/2015/wordml/symex" xmlns:wpg="http://schemas.microsoft.com/office/word/2010/wordprocessingGroup" xmlns:wpi="http://schemas.microsoft.com/office/word/2010/wordprocessingInk" xmlns:wne="http://schemas.microsoft.com/office/word/2006/wordml" xmlns:wps="http://schemas.microsoft.com/office/word/2010/wordprocessingShape" mc:Ignorable="w14 w15 w16se w16cid w16 w16cex w16sdtdh wp14">
+<w:document xmlns:wpc="http://schemas.microsoft.com/office/word/2010/wordprocessingCanvas" xmlns:cx="http://schemas.microsoft.com/office/drawing/2014/chartex" xmlns:cx1="http://schemas.microsoft.com/office/drawing/2015/9/8/chartex" xmlns:cx2="http://schemas.microsoft.com/office/drawing/2015/10/21/chartex" xmlns:cx3="http://schemas.microsoft.com/office/drawing/2016/5/9/chartex" xmlns:cx4="http://schemas.microsoft.com/office/drawing/2016/5/10/chartex" xmlns:cx5="http://schemas.microsoft.com/office/drawing/2016/5/11/chartex" xmlns:cx6="http://schemas.microsoft.com/office/drawing/2016/5/12/chartex" xmlns:cx7="http://schemas.microsoft.com/office/drawing/2016/5/13/chartex" xmlns:cx8="http://schemas.microsoft.com/office/drawing/2016/5/14/chartex" xmlns:mc="http://schemas.openxmlformats.org/markup-compatibility/2006" xmlns:aink="http://schemas.microsoft.com/office/drawing/2016/ink" xmlns:am3d="http://schemas.microsoft.com/office/drawing/2017/model3d" xmlns:o="urn:schemas-microsoft-com:office:office" xmlns:oel="http://schemas.microsoft.com/office/2019/extlst" xmlns:r="http://schemas.openxmlformats.org/officeDocument/2006/relationships" xmlns:m="http://schemas.openxmlformats.org/officeDocument/2006/math" xmlns:v="urn:schemas-microsoft-com:vml" xmlns:wp14="http://schemas.microsoft.com/office/word/2010/wordprocessingDrawing" xmlns:wp="http://schemas.openxmlformats.org/drawingml/2006/wordprocessingDrawing" xmlns:w10="urn:schemas-microsoft-com:office:word" xmlns:w="http://schemas.openxmlformats.org/wordprocessingml/2006/main" xmlns:w14="http://schemas.microsoft.com/office/word/2010/wordml" xmlns:w15="http://schemas.microsoft.com/office/word/2012/wordml" xmlns:w16cex="http://schemas.microsoft.com/office/word/2018/wordml/cex" xmlns:w16cid="http://schemas.microsoft.com/office/word/2016/wordml/cid" xmlns:w16="http://schemas.microsoft.com/office/word/2018/wordml" xmlns:w16du="http://schemas.microsoft.com/office/word/2023/wordml/word16du" xmlns:w16sdtdh="http://schemas.microsoft.com/office/word/2020/wordml/sdtdatahash" xmlns:w16sdtfl="http://schemas.microsoft.com/office/word/2024/wordml/sdtformatlock" xmlns:w16se="http://schemas.microsoft.com/office/word/2015/wordml/symex" xmlns:wpg="http://schemas.microsoft.com/office/word/2010/wordprocessingGroup" xmlns:wpi="http://schemas.microsoft.com/office/word/2010/wordprocessingInk" xmlns:wne="http://schemas.microsoft.com/office/word/2006/wordml" xmlns:wps="http://schemas.microsoft.com/office/word/2010/wordprocessingShape" mc:Ignorable="w14 w15 w16se w16cid w16 w16cex w16sdtdh w16sdtfl w16du wp14">
   <w:body>
     <w:p>
       <w:pPr>
@@ -6209,7 +6209,27 @@
                 <w:sz w:val="32"/>
                 <w:szCs w:val="32"/>
               </w:rPr>
-              <w:t>sx px b—ª.qe¢ªYix</w:t>
+              <w:t>sx px b—</w:t>
+            </w:r>
+            <w:proofErr w:type="gramStart"/>
+            <w:r>
+              <w:rPr>
+                <w:rFonts w:ascii="BRH Malayalam Extra" w:hAnsi="BRH Malayalam Extra" w:cs="BRH Malayalam Extra"/>
+                <w:color w:val="000000"/>
+                <w:sz w:val="32"/>
+                <w:szCs w:val="32"/>
+              </w:rPr>
+              <w:t>ª.qe</w:t>
+            </w:r>
+            <w:proofErr w:type="gramEnd"/>
+            <w:r>
+              <w:rPr>
+                <w:rFonts w:ascii="BRH Malayalam Extra" w:hAnsi="BRH Malayalam Extra" w:cs="BRH Malayalam Extra"/>
+                <w:color w:val="000000"/>
+                <w:sz w:val="32"/>
+                <w:szCs w:val="32"/>
+              </w:rPr>
+              <w:t>¢ªYix</w:t>
             </w:r>
             <w:r>
               <w:rPr>
@@ -6419,7 +6439,27 @@
                 <w:sz w:val="32"/>
                 <w:szCs w:val="32"/>
               </w:rPr>
-              <w:t>s¦ b—ª.qe¢ªYix</w:t>
+              <w:t>s¦ b—</w:t>
+            </w:r>
+            <w:proofErr w:type="gramStart"/>
+            <w:r>
+              <w:rPr>
+                <w:rFonts w:ascii="BRH Malayalam Extra" w:hAnsi="BRH Malayalam Extra" w:cs="BRH Malayalam Extra"/>
+                <w:color w:val="000000"/>
+                <w:sz w:val="32"/>
+                <w:szCs w:val="32"/>
+              </w:rPr>
+              <w:t>ª.qe</w:t>
+            </w:r>
+            <w:proofErr w:type="gramEnd"/>
+            <w:r>
+              <w:rPr>
+                <w:rFonts w:ascii="BRH Malayalam Extra" w:hAnsi="BRH Malayalam Extra" w:cs="BRH Malayalam Extra"/>
+                <w:color w:val="000000"/>
+                <w:sz w:val="32"/>
+                <w:szCs w:val="32"/>
+              </w:rPr>
+              <w:t>¢ªYix</w:t>
             </w:r>
             <w:r>
               <w:rPr>
@@ -7783,7 +7823,27 @@
                 <w:sz w:val="32"/>
                 <w:szCs w:val="32"/>
               </w:rPr>
-              <w:t>sx px b—ª.qe¢ªYix</w:t>
+              <w:t>sx px b—</w:t>
+            </w:r>
+            <w:proofErr w:type="gramStart"/>
+            <w:r>
+              <w:rPr>
+                <w:rFonts w:ascii="BRH Malayalam Extra" w:hAnsi="BRH Malayalam Extra" w:cs="BRH Malayalam Extra"/>
+                <w:color w:val="000000"/>
+                <w:sz w:val="32"/>
+                <w:szCs w:val="32"/>
+              </w:rPr>
+              <w:t>ª.qe</w:t>
+            </w:r>
+            <w:proofErr w:type="gramEnd"/>
+            <w:r>
+              <w:rPr>
+                <w:rFonts w:ascii="BRH Malayalam Extra" w:hAnsi="BRH Malayalam Extra" w:cs="BRH Malayalam Extra"/>
+                <w:color w:val="000000"/>
+                <w:sz w:val="32"/>
+                <w:szCs w:val="32"/>
+              </w:rPr>
+              <w:t>¢ªYix</w:t>
             </w:r>
             <w:r>
               <w:rPr>
@@ -7930,25 +7990,65 @@
                 <w:sz w:val="32"/>
                 <w:szCs w:val="32"/>
               </w:rPr>
-              <w:t>b—ª.qe¢ªYix</w:t>
-            </w:r>
-            <w:r>
-              <w:rPr>
-                <w:rFonts w:ascii="BRH Malayalam Extra" w:hAnsi="BRH Malayalam Extra" w:cs="BRH Malayalam Extra"/>
-                <w:color w:val="000000"/>
-                <w:sz w:val="26"/>
-                <w:szCs w:val="32"/>
-              </w:rPr>
-              <w:t>–</w:t>
-            </w:r>
-            <w:r>
-              <w:rPr>
-                <w:rFonts w:ascii="BRH Malayalam Extra" w:hAnsi="BRH Malayalam Extra" w:cs="BRH Malayalam Extra"/>
-                <w:color w:val="000000"/>
-                <w:sz w:val="32"/>
-                <w:szCs w:val="32"/>
-              </w:rPr>
-              <w:t>s¦ b—ª.qe¢ªYix</w:t>
+              <w:t>b—</w:t>
+            </w:r>
+            <w:proofErr w:type="gramStart"/>
+            <w:r>
+              <w:rPr>
+                <w:rFonts w:ascii="BRH Malayalam Extra" w:hAnsi="BRH Malayalam Extra" w:cs="BRH Malayalam Extra"/>
+                <w:color w:val="000000"/>
+                <w:sz w:val="32"/>
+                <w:szCs w:val="32"/>
+              </w:rPr>
+              <w:t>ª.qe</w:t>
+            </w:r>
+            <w:proofErr w:type="gramEnd"/>
+            <w:r>
+              <w:rPr>
+                <w:rFonts w:ascii="BRH Malayalam Extra" w:hAnsi="BRH Malayalam Extra" w:cs="BRH Malayalam Extra"/>
+                <w:color w:val="000000"/>
+                <w:sz w:val="32"/>
+                <w:szCs w:val="32"/>
+              </w:rPr>
+              <w:t>¢ªYix</w:t>
+            </w:r>
+            <w:r>
+              <w:rPr>
+                <w:rFonts w:ascii="BRH Malayalam Extra" w:hAnsi="BRH Malayalam Extra" w:cs="BRH Malayalam Extra"/>
+                <w:color w:val="000000"/>
+                <w:sz w:val="26"/>
+                <w:szCs w:val="32"/>
+              </w:rPr>
+              <w:t>–</w:t>
+            </w:r>
+            <w:r>
+              <w:rPr>
+                <w:rFonts w:ascii="BRH Malayalam Extra" w:hAnsi="BRH Malayalam Extra" w:cs="BRH Malayalam Extra"/>
+                <w:color w:val="000000"/>
+                <w:sz w:val="32"/>
+                <w:szCs w:val="32"/>
+              </w:rPr>
+              <w:t>s¦ b—</w:t>
+            </w:r>
+            <w:proofErr w:type="gramStart"/>
+            <w:r>
+              <w:rPr>
+                <w:rFonts w:ascii="BRH Malayalam Extra" w:hAnsi="BRH Malayalam Extra" w:cs="BRH Malayalam Extra"/>
+                <w:color w:val="000000"/>
+                <w:sz w:val="32"/>
+                <w:szCs w:val="32"/>
+              </w:rPr>
+              <w:t>ª.qe</w:t>
+            </w:r>
+            <w:proofErr w:type="gramEnd"/>
+            <w:r>
+              <w:rPr>
+                <w:rFonts w:ascii="BRH Malayalam Extra" w:hAnsi="BRH Malayalam Extra" w:cs="BRH Malayalam Extra"/>
+                <w:color w:val="000000"/>
+                <w:sz w:val="32"/>
+                <w:szCs w:val="32"/>
+              </w:rPr>
+              <w:t>¢ªYix</w:t>
             </w:r>
             <w:r>
               <w:rPr>
@@ -23293,7 +23393,7 @@
 </file>
 
 <file path=word/endnotes.xml><?xml version="1.0" encoding="utf-8"?>
-<w:endnotes xmlns:wpc="http://schemas.microsoft.com/office/word/2010/wordprocessingCanvas" xmlns:cx="http://schemas.microsoft.com/office/drawing/2014/chartex" xmlns:cx1="http://schemas.microsoft.com/office/drawing/2015/9/8/chartex" xmlns:cx2="http://schemas.microsoft.com/office/drawing/2015/10/21/chartex" xmlns:cx3="http://schemas.microsoft.com/office/drawing/2016/5/9/chartex" xmlns:cx4="http://schemas.microsoft.com/office/drawing/2016/5/10/chartex" xmlns:cx5="http://schemas.microsoft.com/office/drawing/2016/5/11/chartex" xmlns:cx6="http://schemas.microsoft.com/office/drawing/2016/5/12/chartex" xmlns:cx7="http://schemas.microsoft.com/office/drawing/2016/5/13/chartex" xmlns:cx8="http://schemas.microsoft.com/office/drawing/2016/5/14/chartex" xmlns:mc="http://schemas.openxmlformats.org/markup-compatibility/2006" xmlns:aink="http://schemas.microsoft.com/office/drawing/2016/ink" xmlns:am3d="http://schemas.microsoft.com/office/drawing/2017/model3d" xmlns:o="urn:schemas-microsoft-com:office:office" xmlns:oel="http://schemas.microsoft.com/office/2019/extlst" xmlns:r="http://schemas.openxmlformats.org/officeDocument/2006/relationships" xmlns:m="http://schemas.openxmlformats.org/officeDocument/2006/math" xmlns:v="urn:schemas-microsoft-com:vml" xmlns:wp14="http://schemas.microsoft.com/office/word/2010/wordprocessingDrawing" xmlns:wp="http://schemas.openxmlformats.org/drawingml/2006/wordprocessingDrawing" xmlns:w10="urn:schemas-microsoft-com:office:word" xmlns:w="http://schemas.openxmlformats.org/wordprocessingml/2006/main" xmlns:w14="http://schemas.microsoft.com/office/word/2010/wordml" xmlns:w15="http://schemas.microsoft.com/office/word/2012/wordml" xmlns:w16cex="http://schemas.microsoft.com/office/word/2018/wordml/cex" xmlns:w16cid="http://schemas.microsoft.com/office/word/2016/wordml/cid" xmlns:w16="http://schemas.microsoft.com/office/word/2018/wordml" xmlns:w16sdtdh="http://schemas.microsoft.com/office/word/2020/wordml/sdtdatahash" xmlns:w16se="http://schemas.microsoft.com/office/word/2015/wordml/symex" xmlns:wpg="http://schemas.microsoft.com/office/word/2010/wordprocessingGroup" xmlns:wpi="http://schemas.microsoft.com/office/word/2010/wordprocessingInk" xmlns:wne="http://schemas.microsoft.com/office/word/2006/wordml" xmlns:wps="http://schemas.microsoft.com/office/word/2010/wordprocessingShape" mc:Ignorable="w14 w15 w16se w16cid w16 w16cex w16sdtdh wp14">
+<w:endnotes xmlns:wpc="http://schemas.microsoft.com/office/word/2010/wordprocessingCanvas" xmlns:cx="http://schemas.microsoft.com/office/drawing/2014/chartex" xmlns:cx1="http://schemas.microsoft.com/office/drawing/2015/9/8/chartex" xmlns:cx2="http://schemas.microsoft.com/office/drawing/2015/10/21/chartex" xmlns:cx3="http://schemas.microsoft.com/office/drawing/2016/5/9/chartex" xmlns:cx4="http://schemas.microsoft.com/office/drawing/2016/5/10/chartex" xmlns:cx5="http://schemas.microsoft.com/office/drawing/2016/5/11/chartex" xmlns:cx6="http://schemas.microsoft.com/office/drawing/2016/5/12/chartex" xmlns:cx7="http://schemas.microsoft.com/office/drawing/2016/5/13/chartex" xmlns:cx8="http://schemas.microsoft.com/office/drawing/2016/5/14/chartex" xmlns:mc="http://schemas.openxmlformats.org/markup-compatibility/2006" xmlns:aink="http://schemas.microsoft.com/office/drawing/2016/ink" xmlns:am3d="http://schemas.microsoft.com/office/drawing/2017/model3d" xmlns:o="urn:schemas-microsoft-com:office:office" xmlns:oel="http://schemas.microsoft.com/office/2019/extlst" xmlns:r="http://schemas.openxmlformats.org/officeDocument/2006/relationships" xmlns:m="http://schemas.openxmlformats.org/officeDocument/2006/math" xmlns:v="urn:schemas-microsoft-com:vml" xmlns:wp14="http://schemas.microsoft.com/office/word/2010/wordprocessingDrawing" xmlns:wp="http://schemas.openxmlformats.org/drawingml/2006/wordprocessingDrawing" xmlns:w10="urn:schemas-microsoft-com:office:word" xmlns:w="http://schemas.openxmlformats.org/wordprocessingml/2006/main" xmlns:w14="http://schemas.microsoft.com/office/word/2010/wordml" xmlns:w15="http://schemas.microsoft.com/office/word/2012/wordml" xmlns:w16cex="http://schemas.microsoft.com/office/word/2018/wordml/cex" xmlns:w16cid="http://schemas.microsoft.com/office/word/2016/wordml/cid" xmlns:w16="http://schemas.microsoft.com/office/word/2018/wordml" xmlns:w16du="http://schemas.microsoft.com/office/word/2023/wordml/word16du" xmlns:w16sdtdh="http://schemas.microsoft.com/office/word/2020/wordml/sdtdatahash" xmlns:w16sdtfl="http://schemas.microsoft.com/office/word/2024/wordml/sdtformatlock" xmlns:w16se="http://schemas.microsoft.com/office/word/2015/wordml/symex" xmlns:wpg="http://schemas.microsoft.com/office/word/2010/wordprocessingGroup" xmlns:wpi="http://schemas.microsoft.com/office/word/2010/wordprocessingInk" xmlns:wne="http://schemas.microsoft.com/office/word/2006/wordml" xmlns:wps="http://schemas.microsoft.com/office/word/2010/wordprocessingShape" mc:Ignorable="w14 w15 w16se w16cid w16 w16cex w16sdtdh w16sdtfl w16du wp14">
   <w:endnote w:type="separator" w:id="-1">
     <w:p>
       <w:pPr>
@@ -23318,7 +23418,7 @@
 </file>
 
 <file path=word/footer1.xml><?xml version="1.0" encoding="utf-8"?>
-<w:ftr xmlns:wpc="http://schemas.microsoft.com/office/word/2010/wordprocessingCanvas" xmlns:cx="http://schemas.microsoft.com/office/drawing/2014/chartex" xmlns:cx1="http://schemas.microsoft.com/office/drawing/2015/9/8/chartex" xmlns:cx2="http://schemas.microsoft.com/office/drawing/2015/10/21/chartex" xmlns:cx3="http://schemas.microsoft.com/office/drawing/2016/5/9/chartex" xmlns:cx4="http://schemas.microsoft.com/office/drawing/2016/5/10/chartex" xmlns:cx5="http://schemas.microsoft.com/office/drawing/2016/5/11/chartex" xmlns:cx6="http://schemas.microsoft.com/office/drawing/2016/5/12/chartex" xmlns:cx7="http://schemas.microsoft.com/office/drawing/2016/5/13/chartex" xmlns:cx8="http://schemas.microsoft.com/office/drawing/2016/5/14/chartex" xmlns:mc="http://schemas.openxmlformats.org/markup-compatibility/2006" xmlns:aink="http://schemas.microsoft.com/office/drawing/2016/ink" xmlns:am3d="http://schemas.microsoft.com/office/drawing/2017/model3d" xmlns:o="urn:schemas-microsoft-com:office:office" xmlns:oel="http://schemas.microsoft.com/office/2019/extlst" xmlns:r="http://schemas.openxmlformats.org/officeDocument/2006/relationships" xmlns:m="http://schemas.openxmlformats.org/officeDocument/2006/math" xmlns:v="urn:schemas-microsoft-com:vml" xmlns:wp14="http://schemas.microsoft.com/office/word/2010/wordprocessingDrawing" xmlns:wp="http://schemas.openxmlformats.org/drawingml/2006/wordprocessingDrawing" xmlns:w10="urn:schemas-microsoft-com:office:word" xmlns:w="http://schemas.openxmlformats.org/wordprocessingml/2006/main" xmlns:w14="http://schemas.microsoft.com/office/word/2010/wordml" xmlns:w15="http://schemas.microsoft.com/office/word/2012/wordml" xmlns:w16cex="http://schemas.microsoft.com/office/word/2018/wordml/cex" xmlns:w16cid="http://schemas.microsoft.com/office/word/2016/wordml/cid" xmlns:w16="http://schemas.microsoft.com/office/word/2018/wordml" xmlns:w16sdtdh="http://schemas.microsoft.com/office/word/2020/wordml/sdtdatahash" xmlns:w16se="http://schemas.microsoft.com/office/word/2015/wordml/symex" xmlns:wpg="http://schemas.microsoft.com/office/word/2010/wordprocessingGroup" xmlns:wpi="http://schemas.microsoft.com/office/word/2010/wordprocessingInk" xmlns:wne="http://schemas.microsoft.com/office/word/2006/wordml" xmlns:wps="http://schemas.microsoft.com/office/word/2010/wordprocessingShape" mc:Ignorable="w14 w15 w16se w16cid w16 w16cex w16sdtdh wp14">
+<w:ftr xmlns:wpc="http://schemas.microsoft.com/office/word/2010/wordprocessingCanvas" xmlns:cx="http://schemas.microsoft.com/office/drawing/2014/chartex" xmlns:cx1="http://schemas.microsoft.com/office/drawing/2015/9/8/chartex" xmlns:cx2="http://schemas.microsoft.com/office/drawing/2015/10/21/chartex" xmlns:cx3="http://schemas.microsoft.com/office/drawing/2016/5/9/chartex" xmlns:cx4="http://schemas.microsoft.com/office/drawing/2016/5/10/chartex" xmlns:cx5="http://schemas.microsoft.com/office/drawing/2016/5/11/chartex" xmlns:cx6="http://schemas.microsoft.com/office/drawing/2016/5/12/chartex" xmlns:cx7="http://schemas.microsoft.com/office/drawing/2016/5/13/chartex" xmlns:cx8="http://schemas.microsoft.com/office/drawing/2016/5/14/chartex" xmlns:mc="http://schemas.openxmlformats.org/markup-compatibility/2006" xmlns:aink="http://schemas.microsoft.com/office/drawing/2016/ink" xmlns:am3d="http://schemas.microsoft.com/office/drawing/2017/model3d" xmlns:o="urn:schemas-microsoft-com:office:office" xmlns:oel="http://schemas.microsoft.com/office/2019/extlst" xmlns:r="http://schemas.openxmlformats.org/officeDocument/2006/relationships" xmlns:m="http://schemas.openxmlformats.org/officeDocument/2006/math" xmlns:v="urn:schemas-microsoft-com:vml" xmlns:wp14="http://schemas.microsoft.com/office/word/2010/wordprocessingDrawing" xmlns:wp="http://schemas.openxmlformats.org/drawingml/2006/wordprocessingDrawing" xmlns:w10="urn:schemas-microsoft-com:office:word" xmlns:w="http://schemas.openxmlformats.org/wordprocessingml/2006/main" xmlns:w14="http://schemas.microsoft.com/office/word/2010/wordml" xmlns:w15="http://schemas.microsoft.com/office/word/2012/wordml" xmlns:w16cex="http://schemas.microsoft.com/office/word/2018/wordml/cex" xmlns:w16cid="http://schemas.microsoft.com/office/word/2016/wordml/cid" xmlns:w16="http://schemas.microsoft.com/office/word/2018/wordml" xmlns:w16du="http://schemas.microsoft.com/office/word/2023/wordml/word16du" xmlns:w16sdtdh="http://schemas.microsoft.com/office/word/2020/wordml/sdtdatahash" xmlns:w16sdtfl="http://schemas.microsoft.com/office/word/2024/wordml/sdtformatlock" xmlns:w16se="http://schemas.microsoft.com/office/word/2015/wordml/symex" xmlns:wpg="http://schemas.microsoft.com/office/word/2010/wordprocessingGroup" xmlns:wpi="http://schemas.microsoft.com/office/word/2010/wordprocessingInk" xmlns:wne="http://schemas.microsoft.com/office/word/2006/wordml" xmlns:wps="http://schemas.microsoft.com/office/word/2010/wordprocessingShape" mc:Ignorable="w14 w15 w16se w16cid w16 w16cex w16sdtdh w16sdtfl w16du wp14">
   <w:p>
     <w:pPr>
       <w:pBdr>
@@ -23500,7 +23600,7 @@
 </file>
 
 <file path=word/footer2.xml><?xml version="1.0" encoding="utf-8"?>
-<w:ftr xmlns:wpc="http://schemas.microsoft.com/office/word/2010/wordprocessingCanvas" xmlns:cx="http://schemas.microsoft.com/office/drawing/2014/chartex" xmlns:cx1="http://schemas.microsoft.com/office/drawing/2015/9/8/chartex" xmlns:cx2="http://schemas.microsoft.com/office/drawing/2015/10/21/chartex" xmlns:cx3="http://schemas.microsoft.com/office/drawing/2016/5/9/chartex" xmlns:cx4="http://schemas.microsoft.com/office/drawing/2016/5/10/chartex" xmlns:cx5="http://schemas.microsoft.com/office/drawing/2016/5/11/chartex" xmlns:cx6="http://schemas.microsoft.com/office/drawing/2016/5/12/chartex" xmlns:cx7="http://schemas.microsoft.com/office/drawing/2016/5/13/chartex" xmlns:cx8="http://schemas.microsoft.com/office/drawing/2016/5/14/chartex" xmlns:mc="http://schemas.openxmlformats.org/markup-compatibility/2006" xmlns:aink="http://schemas.microsoft.com/office/drawing/2016/ink" xmlns:am3d="http://schemas.microsoft.com/office/drawing/2017/model3d" xmlns:o="urn:schemas-microsoft-com:office:office" xmlns:oel="http://schemas.microsoft.com/office/2019/extlst" xmlns:r="http://schemas.openxmlformats.org/officeDocument/2006/relationships" xmlns:m="http://schemas.openxmlformats.org/officeDocument/2006/math" xmlns:v="urn:schemas-microsoft-com:vml" xmlns:wp14="http://schemas.microsoft.com/office/word/2010/wordprocessingDrawing" xmlns:wp="http://schemas.openxmlformats.org/drawingml/2006/wordprocessingDrawing" xmlns:w10="urn:schemas-microsoft-com:office:word" xmlns:w="http://schemas.openxmlformats.org/wordprocessingml/2006/main" xmlns:w14="http://schemas.microsoft.com/office/word/2010/wordml" xmlns:w15="http://schemas.microsoft.com/office/word/2012/wordml" xmlns:w16cex="http://schemas.microsoft.com/office/word/2018/wordml/cex" xmlns:w16cid="http://schemas.microsoft.com/office/word/2016/wordml/cid" xmlns:w16="http://schemas.microsoft.com/office/word/2018/wordml" xmlns:w16sdtdh="http://schemas.microsoft.com/office/word/2020/wordml/sdtdatahash" xmlns:w16se="http://schemas.microsoft.com/office/word/2015/wordml/symex" xmlns:wpg="http://schemas.microsoft.com/office/word/2010/wordprocessingGroup" xmlns:wpi="http://schemas.microsoft.com/office/word/2010/wordprocessingInk" xmlns:wne="http://schemas.microsoft.com/office/word/2006/wordml" xmlns:wps="http://schemas.microsoft.com/office/word/2010/wordprocessingShape" mc:Ignorable="w14 w15 w16se w16cid w16 w16cex w16sdtdh wp14">
+<w:ftr xmlns:wpc="http://schemas.microsoft.com/office/word/2010/wordprocessingCanvas" xmlns:cx="http://schemas.microsoft.com/office/drawing/2014/chartex" xmlns:cx1="http://schemas.microsoft.com/office/drawing/2015/9/8/chartex" xmlns:cx2="http://schemas.microsoft.com/office/drawing/2015/10/21/chartex" xmlns:cx3="http://schemas.microsoft.com/office/drawing/2016/5/9/chartex" xmlns:cx4="http://schemas.microsoft.com/office/drawing/2016/5/10/chartex" xmlns:cx5="http://schemas.microsoft.com/office/drawing/2016/5/11/chartex" xmlns:cx6="http://schemas.microsoft.com/office/drawing/2016/5/12/chartex" xmlns:cx7="http://schemas.microsoft.com/office/drawing/2016/5/13/chartex" xmlns:cx8="http://schemas.microsoft.com/office/drawing/2016/5/14/chartex" xmlns:mc="http://schemas.openxmlformats.org/markup-compatibility/2006" xmlns:aink="http://schemas.microsoft.com/office/drawing/2016/ink" xmlns:am3d="http://schemas.microsoft.com/office/drawing/2017/model3d" xmlns:o="urn:schemas-microsoft-com:office:office" xmlns:oel="http://schemas.microsoft.com/office/2019/extlst" xmlns:r="http://schemas.openxmlformats.org/officeDocument/2006/relationships" xmlns:m="http://schemas.openxmlformats.org/officeDocument/2006/math" xmlns:v="urn:schemas-microsoft-com:vml" xmlns:wp14="http://schemas.microsoft.com/office/word/2010/wordprocessingDrawing" xmlns:wp="http://schemas.openxmlformats.org/drawingml/2006/wordprocessingDrawing" xmlns:w10="urn:schemas-microsoft-com:office:word" xmlns:w="http://schemas.openxmlformats.org/wordprocessingml/2006/main" xmlns:w14="http://schemas.microsoft.com/office/word/2010/wordml" xmlns:w15="http://schemas.microsoft.com/office/word/2012/wordml" xmlns:w16cex="http://schemas.microsoft.com/office/word/2018/wordml/cex" xmlns:w16cid="http://schemas.microsoft.com/office/word/2016/wordml/cid" xmlns:w16="http://schemas.microsoft.com/office/word/2018/wordml" xmlns:w16du="http://schemas.microsoft.com/office/word/2023/wordml/word16du" xmlns:w16sdtdh="http://schemas.microsoft.com/office/word/2020/wordml/sdtdatahash" xmlns:w16sdtfl="http://schemas.microsoft.com/office/word/2024/wordml/sdtformatlock" xmlns:w16se="http://schemas.microsoft.com/office/word/2015/wordml/symex" xmlns:wpg="http://schemas.microsoft.com/office/word/2010/wordprocessingGroup" xmlns:wpi="http://schemas.microsoft.com/office/word/2010/wordprocessingInk" xmlns:wne="http://schemas.microsoft.com/office/word/2006/wordml" xmlns:wps="http://schemas.microsoft.com/office/word/2010/wordprocessingShape" mc:Ignorable="w14 w15 w16se w16cid w16 w16cex w16sdtdh w16sdtfl w16du wp14">
   <w:p>
     <w:pPr>
       <w:pBdr>
@@ -23706,7 +23806,7 @@
 </file>
 
 <file path=word/footnotes.xml><?xml version="1.0" encoding="utf-8"?>
-<w:footnotes xmlns:wpc="http://schemas.microsoft.com/office/word/2010/wordprocessingCanvas" xmlns:cx="http://schemas.microsoft.com/office/drawing/2014/chartex" xmlns:cx1="http://schemas.microsoft.com/office/drawing/2015/9/8/chartex" xmlns:cx2="http://schemas.microsoft.com/office/drawing/2015/10/21/chartex" xmlns:cx3="http://schemas.microsoft.com/office/drawing/2016/5/9/chartex" xmlns:cx4="http://schemas.microsoft.com/office/drawing/2016/5/10/chartex" xmlns:cx5="http://schemas.microsoft.com/office/drawing/2016/5/11/chartex" xmlns:cx6="http://schemas.microsoft.com/office/drawing/2016/5/12/chartex" xmlns:cx7="http://schemas.microsoft.com/office/drawing/2016/5/13/chartex" xmlns:cx8="http://schemas.microsoft.com/office/drawing/2016/5/14/chartex" xmlns:mc="http://schemas.openxmlformats.org/markup-compatibility/2006" xmlns:aink="http://schemas.microsoft.com/office/drawing/2016/ink" xmlns:am3d="http://schemas.microsoft.com/office/drawing/2017/model3d" xmlns:o="urn:schemas-microsoft-com:office:office" xmlns:oel="http://schemas.microsoft.com/office/2019/extlst" xmlns:r="http://schemas.openxmlformats.org/officeDocument/2006/relationships" xmlns:m="http://schemas.openxmlformats.org/officeDocument/2006/math" xmlns:v="urn:schemas-microsoft-com:vml" xmlns:wp14="http://schemas.microsoft.com/office/word/2010/wordprocessingDrawing" xmlns:wp="http://schemas.openxmlformats.org/drawingml/2006/wordprocessingDrawing" xmlns:w10="urn:schemas-microsoft-com:office:word" xmlns:w="http://schemas.openxmlformats.org/wordprocessingml/2006/main" xmlns:w14="http://schemas.microsoft.com/office/word/2010/wordml" xmlns:w15="http://schemas.microsoft.com/office/word/2012/wordml" xmlns:w16cex="http://schemas.microsoft.com/office/word/2018/wordml/cex" xmlns:w16cid="http://schemas.microsoft.com/office/word/2016/wordml/cid" xmlns:w16="http://schemas.microsoft.com/office/word/2018/wordml" xmlns:w16sdtdh="http://schemas.microsoft.com/office/word/2020/wordml/sdtdatahash" xmlns:w16se="http://schemas.microsoft.com/office/word/2015/wordml/symex" xmlns:wpg="http://schemas.microsoft.com/office/word/2010/wordprocessingGroup" xmlns:wpi="http://schemas.microsoft.com/office/word/2010/wordprocessingInk" xmlns:wne="http://schemas.microsoft.com/office/word/2006/wordml" xmlns:wps="http://schemas.microsoft.com/office/word/2010/wordprocessingShape" mc:Ignorable="w14 w15 w16se w16cid w16 w16cex w16sdtdh wp14">
+<w:footnotes xmlns:wpc="http://schemas.microsoft.com/office/word/2010/wordprocessingCanvas" xmlns:cx="http://schemas.microsoft.com/office/drawing/2014/chartex" xmlns:cx1="http://schemas.microsoft.com/office/drawing/2015/9/8/chartex" xmlns:cx2="http://schemas.microsoft.com/office/drawing/2015/10/21/chartex" xmlns:cx3="http://schemas.microsoft.com/office/drawing/2016/5/9/chartex" xmlns:cx4="http://schemas.microsoft.com/office/drawing/2016/5/10/chartex" xmlns:cx5="http://schemas.microsoft.com/office/drawing/2016/5/11/chartex" xmlns:cx6="http://schemas.microsoft.com/office/drawing/2016/5/12/chartex" xmlns:cx7="http://schemas.microsoft.com/office/drawing/2016/5/13/chartex" xmlns:cx8="http://schemas.microsoft.com/office/drawing/2016/5/14/chartex" xmlns:mc="http://schemas.openxmlformats.org/markup-compatibility/2006" xmlns:aink="http://schemas.microsoft.com/office/drawing/2016/ink" xmlns:am3d="http://schemas.microsoft.com/office/drawing/2017/model3d" xmlns:o="urn:schemas-microsoft-com:office:office" xmlns:oel="http://schemas.microsoft.com/office/2019/extlst" xmlns:r="http://schemas.openxmlformats.org/officeDocument/2006/relationships" xmlns:m="http://schemas.openxmlformats.org/officeDocument/2006/math" xmlns:v="urn:schemas-microsoft-com:vml" xmlns:wp14="http://schemas.microsoft.com/office/word/2010/wordprocessingDrawing" xmlns:wp="http://schemas.openxmlformats.org/drawingml/2006/wordprocessingDrawing" xmlns:w10="urn:schemas-microsoft-com:office:word" xmlns:w="http://schemas.openxmlformats.org/wordprocessingml/2006/main" xmlns:w14="http://schemas.microsoft.com/office/word/2010/wordml" xmlns:w15="http://schemas.microsoft.com/office/word/2012/wordml" xmlns:w16cex="http://schemas.microsoft.com/office/word/2018/wordml/cex" xmlns:w16cid="http://schemas.microsoft.com/office/word/2016/wordml/cid" xmlns:w16="http://schemas.microsoft.com/office/word/2018/wordml" xmlns:w16du="http://schemas.microsoft.com/office/word/2023/wordml/word16du" xmlns:w16sdtdh="http://schemas.microsoft.com/office/word/2020/wordml/sdtdatahash" xmlns:w16sdtfl="http://schemas.microsoft.com/office/word/2024/wordml/sdtformatlock" xmlns:w16se="http://schemas.microsoft.com/office/word/2015/wordml/symex" xmlns:wpg="http://schemas.microsoft.com/office/word/2010/wordprocessingGroup" xmlns:wpi="http://schemas.microsoft.com/office/word/2010/wordprocessingInk" xmlns:wne="http://schemas.microsoft.com/office/word/2006/wordml" xmlns:wps="http://schemas.microsoft.com/office/word/2010/wordprocessingShape" mc:Ignorable="w14 w15 w16se w16cid w16 w16cex w16sdtdh w16sdtfl w16du wp14">
   <w:footnote w:type="separator" w:id="-1">
     <w:p>
       <w:pPr>
@@ -23731,7 +23831,7 @@
 </file>
 
 <file path=word/header1.xml><?xml version="1.0" encoding="utf-8"?>
-<w:hdr xmlns:wpc="http://schemas.microsoft.com/office/word/2010/wordprocessingCanvas" xmlns:cx="http://schemas.microsoft.com/office/drawing/2014/chartex" xmlns:cx1="http://schemas.microsoft.com/office/drawing/2015/9/8/chartex" xmlns:cx2="http://schemas.microsoft.com/office/drawing/2015/10/21/chartex" xmlns:cx3="http://schemas.microsoft.com/office/drawing/2016/5/9/chartex" xmlns:cx4="http://schemas.microsoft.com/office/drawing/2016/5/10/chartex" xmlns:cx5="http://schemas.microsoft.com/office/drawing/2016/5/11/chartex" xmlns:cx6="http://schemas.microsoft.com/office/drawing/2016/5/12/chartex" xmlns:cx7="http://schemas.microsoft.com/office/drawing/2016/5/13/chartex" xmlns:cx8="http://schemas.microsoft.com/office/drawing/2016/5/14/chartex" xmlns:mc="http://schemas.openxmlformats.org/markup-compatibility/2006" xmlns:aink="http://schemas.microsoft.com/office/drawing/2016/ink" xmlns:am3d="http://schemas.microsoft.com/office/drawing/2017/model3d" xmlns:o="urn:schemas-microsoft-com:office:office" xmlns:oel="http://schemas.microsoft.com/office/2019/extlst" xmlns:r="http://schemas.openxmlformats.org/officeDocument/2006/relationships" xmlns:m="http://schemas.openxmlformats.org/officeDocument/2006/math" xmlns:v="urn:schemas-microsoft-com:vml" xmlns:wp14="http://schemas.microsoft.com/office/word/2010/wordprocessingDrawing" xmlns:wp="http://schemas.openxmlformats.org/drawingml/2006/wordprocessingDrawing" xmlns:w10="urn:schemas-microsoft-com:office:word" xmlns:w="http://schemas.openxmlformats.org/wordprocessingml/2006/main" xmlns:w14="http://schemas.microsoft.com/office/word/2010/wordml" xmlns:w15="http://schemas.microsoft.com/office/word/2012/wordml" xmlns:w16cex="http://schemas.microsoft.com/office/word/2018/wordml/cex" xmlns:w16cid="http://schemas.microsoft.com/office/word/2016/wordml/cid" xmlns:w16="http://schemas.microsoft.com/office/word/2018/wordml" xmlns:w16sdtdh="http://schemas.microsoft.com/office/word/2020/wordml/sdtdatahash" xmlns:w16se="http://schemas.microsoft.com/office/word/2015/wordml/symex" xmlns:wpg="http://schemas.microsoft.com/office/word/2010/wordprocessingGroup" xmlns:wpi="http://schemas.microsoft.com/office/word/2010/wordprocessingInk" xmlns:wne="http://schemas.microsoft.com/office/word/2006/wordml" xmlns:wps="http://schemas.microsoft.com/office/word/2010/wordprocessingShape" mc:Ignorable="w14 w15 w16se w16cid w16 w16cex w16sdtdh wp14">
+<w:hdr xmlns:wpc="http://schemas.microsoft.com/office/word/2010/wordprocessingCanvas" xmlns:cx="http://schemas.microsoft.com/office/drawing/2014/chartex" xmlns:cx1="http://schemas.microsoft.com/office/drawing/2015/9/8/chartex" xmlns:cx2="http://schemas.microsoft.com/office/drawing/2015/10/21/chartex" xmlns:cx3="http://schemas.microsoft.com/office/drawing/2016/5/9/chartex" xmlns:cx4="http://schemas.microsoft.com/office/drawing/2016/5/10/chartex" xmlns:cx5="http://schemas.microsoft.com/office/drawing/2016/5/11/chartex" xmlns:cx6="http://schemas.microsoft.com/office/drawing/2016/5/12/chartex" xmlns:cx7="http://schemas.microsoft.com/office/drawing/2016/5/13/chartex" xmlns:cx8="http://schemas.microsoft.com/office/drawing/2016/5/14/chartex" xmlns:mc="http://schemas.openxmlformats.org/markup-compatibility/2006" xmlns:aink="http://schemas.microsoft.com/office/drawing/2016/ink" xmlns:am3d="http://schemas.microsoft.com/office/drawing/2017/model3d" xmlns:o="urn:schemas-microsoft-com:office:office" xmlns:oel="http://schemas.microsoft.com/office/2019/extlst" xmlns:r="http://schemas.openxmlformats.org/officeDocument/2006/relationships" xmlns:m="http://schemas.openxmlformats.org/officeDocument/2006/math" xmlns:v="urn:schemas-microsoft-com:vml" xmlns:wp14="http://schemas.microsoft.com/office/word/2010/wordprocessingDrawing" xmlns:wp="http://schemas.openxmlformats.org/drawingml/2006/wordprocessingDrawing" xmlns:w10="urn:schemas-microsoft-com:office:word" xmlns:w="http://schemas.openxmlformats.org/wordprocessingml/2006/main" xmlns:w14="http://schemas.microsoft.com/office/word/2010/wordml" xmlns:w15="http://schemas.microsoft.com/office/word/2012/wordml" xmlns:w16cex="http://schemas.microsoft.com/office/word/2018/wordml/cex" xmlns:w16cid="http://schemas.microsoft.com/office/word/2016/wordml/cid" xmlns:w16="http://schemas.microsoft.com/office/word/2018/wordml" xmlns:w16du="http://schemas.microsoft.com/office/word/2023/wordml/word16du" xmlns:w16sdtdh="http://schemas.microsoft.com/office/word/2020/wordml/sdtdatahash" xmlns:w16sdtfl="http://schemas.microsoft.com/office/word/2024/wordml/sdtformatlock" xmlns:w16se="http://schemas.microsoft.com/office/word/2015/wordml/symex" xmlns:wpg="http://schemas.microsoft.com/office/word/2010/wordprocessingGroup" xmlns:wpi="http://schemas.microsoft.com/office/word/2010/wordprocessingInk" xmlns:wne="http://schemas.microsoft.com/office/word/2006/wordml" xmlns:wps="http://schemas.microsoft.com/office/word/2010/wordprocessingShape" mc:Ignorable="w14 w15 w16se w16cid w16 w16cex w16sdtdh w16sdtfl w16du wp14">
   <w:p>
     <w:pPr>
       <w:pStyle w:val="Header"/>
@@ -23752,7 +23852,7 @@
 </file>
 
 <file path=word/header2.xml><?xml version="1.0" encoding="utf-8"?>
-<w:hdr xmlns:wpc="http://schemas.microsoft.com/office/word/2010/wordprocessingCanvas" xmlns:cx="http://schemas.microsoft.com/office/drawing/2014/chartex" xmlns:cx1="http://schemas.microsoft.com/office/drawing/2015/9/8/chartex" xmlns:cx2="http://schemas.microsoft.com/office/drawing/2015/10/21/chartex" xmlns:cx3="http://schemas.microsoft.com/office/drawing/2016/5/9/chartex" xmlns:cx4="http://schemas.microsoft.com/office/drawing/2016/5/10/chartex" xmlns:cx5="http://schemas.microsoft.com/office/drawing/2016/5/11/chartex" xmlns:cx6="http://schemas.microsoft.com/office/drawing/2016/5/12/chartex" xmlns:cx7="http://schemas.microsoft.com/office/drawing/2016/5/13/chartex" xmlns:cx8="http://schemas.microsoft.com/office/drawing/2016/5/14/chartex" xmlns:mc="http://schemas.openxmlformats.org/markup-compatibility/2006" xmlns:aink="http://schemas.microsoft.com/office/drawing/2016/ink" xmlns:am3d="http://schemas.microsoft.com/office/drawing/2017/model3d" xmlns:o="urn:schemas-microsoft-com:office:office" xmlns:oel="http://schemas.microsoft.com/office/2019/extlst" xmlns:r="http://schemas.openxmlformats.org/officeDocument/2006/relationships" xmlns:m="http://schemas.openxmlformats.org/officeDocument/2006/math" xmlns:v="urn:schemas-microsoft-com:vml" xmlns:wp14="http://schemas.microsoft.com/office/word/2010/wordprocessingDrawing" xmlns:wp="http://schemas.openxmlformats.org/drawingml/2006/wordprocessingDrawing" xmlns:w10="urn:schemas-microsoft-com:office:word" xmlns:w="http://schemas.openxmlformats.org/wordprocessingml/2006/main" xmlns:w14="http://schemas.microsoft.com/office/word/2010/wordml" xmlns:w15="http://schemas.microsoft.com/office/word/2012/wordml" xmlns:w16cex="http://schemas.microsoft.com/office/word/2018/wordml/cex" xmlns:w16cid="http://schemas.microsoft.com/office/word/2016/wordml/cid" xmlns:w16="http://schemas.microsoft.com/office/word/2018/wordml" xmlns:w16sdtdh="http://schemas.microsoft.com/office/word/2020/wordml/sdtdatahash" xmlns:w16se="http://schemas.microsoft.com/office/word/2015/wordml/symex" xmlns:wpg="http://schemas.microsoft.com/office/word/2010/wordprocessingGroup" xmlns:wpi="http://schemas.microsoft.com/office/word/2010/wordprocessingInk" xmlns:wne="http://schemas.microsoft.com/office/word/2006/wordml" xmlns:wps="http://schemas.microsoft.com/office/word/2010/wordprocessingShape" mc:Ignorable="w14 w15 w16se w16cid w16 w16cex w16sdtdh wp14">
+<w:hdr xmlns:wpc="http://schemas.microsoft.com/office/word/2010/wordprocessingCanvas" xmlns:cx="http://schemas.microsoft.com/office/drawing/2014/chartex" xmlns:cx1="http://schemas.microsoft.com/office/drawing/2015/9/8/chartex" xmlns:cx2="http://schemas.microsoft.com/office/drawing/2015/10/21/chartex" xmlns:cx3="http://schemas.microsoft.com/office/drawing/2016/5/9/chartex" xmlns:cx4="http://schemas.microsoft.com/office/drawing/2016/5/10/chartex" xmlns:cx5="http://schemas.microsoft.com/office/drawing/2016/5/11/chartex" xmlns:cx6="http://schemas.microsoft.com/office/drawing/2016/5/12/chartex" xmlns:cx7="http://schemas.microsoft.com/office/drawing/2016/5/13/chartex" xmlns:cx8="http://schemas.microsoft.com/office/drawing/2016/5/14/chartex" xmlns:mc="http://schemas.openxmlformats.org/markup-compatibility/2006" xmlns:aink="http://schemas.microsoft.com/office/drawing/2016/ink" xmlns:am3d="http://schemas.microsoft.com/office/drawing/2017/model3d" xmlns:o="urn:schemas-microsoft-com:office:office" xmlns:oel="http://schemas.microsoft.com/office/2019/extlst" xmlns:r="http://schemas.openxmlformats.org/officeDocument/2006/relationships" xmlns:m="http://schemas.openxmlformats.org/officeDocument/2006/math" xmlns:v="urn:schemas-microsoft-com:vml" xmlns:wp14="http://schemas.microsoft.com/office/word/2010/wordprocessingDrawing" xmlns:wp="http://schemas.openxmlformats.org/drawingml/2006/wordprocessingDrawing" xmlns:w10="urn:schemas-microsoft-com:office:word" xmlns:w="http://schemas.openxmlformats.org/wordprocessingml/2006/main" xmlns:w14="http://schemas.microsoft.com/office/word/2010/wordml" xmlns:w15="http://schemas.microsoft.com/office/word/2012/wordml" xmlns:w16cex="http://schemas.microsoft.com/office/word/2018/wordml/cex" xmlns:w16cid="http://schemas.microsoft.com/office/word/2016/wordml/cid" xmlns:w16="http://schemas.microsoft.com/office/word/2018/wordml" xmlns:w16du="http://schemas.microsoft.com/office/word/2023/wordml/word16du" xmlns:w16sdtdh="http://schemas.microsoft.com/office/word/2020/wordml/sdtdatahash" xmlns:w16sdtfl="http://schemas.microsoft.com/office/word/2024/wordml/sdtformatlock" xmlns:w16se="http://schemas.microsoft.com/office/word/2015/wordml/symex" xmlns:wpg="http://schemas.microsoft.com/office/word/2010/wordprocessingGroup" xmlns:wpi="http://schemas.microsoft.com/office/word/2010/wordprocessingInk" xmlns:wne="http://schemas.microsoft.com/office/word/2006/wordml" xmlns:wps="http://schemas.microsoft.com/office/word/2010/wordprocessingShape" mc:Ignorable="w14 w15 w16se w16cid w16 w16cex w16sdtdh w16sdtfl w16du wp14">
   <w:p>
     <w:pPr>
       <w:pStyle w:val="Header"/>
@@ -23765,7 +23865,7 @@
 </file>
 
 <file path=word/styles.xml><?xml version="1.0" encoding="utf-8"?>
-<w:styles xmlns:mc="http://schemas.openxmlformats.org/markup-compatibility/2006" xmlns:r="http://schemas.openxmlformats.org/officeDocument/2006/relationships" xmlns:w="http://schemas.openxmlformats.org/wordprocessingml/2006/main" xmlns:w14="http://schemas.microsoft.com/office/word/2010/wordml" xmlns:w15="http://schemas.microsoft.com/office/word/2012/wordml" xmlns:w16cex="http://schemas.microsoft.com/office/word/2018/wordml/cex" xmlns:w16cid="http://schemas.microsoft.com/office/word/2016/wordml/cid" xmlns:w16="http://schemas.microsoft.com/office/word/2018/wordml" xmlns:w16sdtdh="http://schemas.microsoft.com/office/word/2020/wordml/sdtdatahash" xmlns:w16se="http://schemas.microsoft.com/office/word/2015/wordml/symex" mc:Ignorable="w14 w15 w16se w16cid w16 w16cex w16sdtdh">
+<w:styles xmlns:mc="http://schemas.openxmlformats.org/markup-compatibility/2006" xmlns:r="http://schemas.openxmlformats.org/officeDocument/2006/relationships" xmlns:w="http://schemas.openxmlformats.org/wordprocessingml/2006/main" xmlns:w14="http://schemas.microsoft.com/office/word/2010/wordml" xmlns:w15="http://schemas.microsoft.com/office/word/2012/wordml" xmlns:w16cex="http://schemas.microsoft.com/office/word/2018/wordml/cex" xmlns:w16cid="http://schemas.microsoft.com/office/word/2016/wordml/cid" xmlns:w16="http://schemas.microsoft.com/office/word/2018/wordml" xmlns:w16du="http://schemas.microsoft.com/office/word/2023/wordml/word16du" xmlns:w16sdtdh="http://schemas.microsoft.com/office/word/2020/wordml/sdtdatahash" xmlns:w16sdtfl="http://schemas.microsoft.com/office/word/2024/wordml/sdtformatlock" xmlns:w16se="http://schemas.microsoft.com/office/word/2015/wordml/symex" mc:Ignorable="w14 w15 w16se w16cid w16 w16cex w16sdtdh w16sdtfl w16du">
   <w:docDefaults>
     <w:rPrDefault>
       <w:rPr>

</xml_diff>

<commit_message>
nmv 10 09 2026
</commit_message>
<xml_diff>
--- a/TS Jatai Ghanam Project/TS 3.5/TS 3.5 Ghanam Malayalam Corrections.docx
+++ b/TS Jatai Ghanam Project/TS 3.5/TS 3.5 Ghanam Malayalam Corrections.docx
@@ -2,6 +2,277 @@
 <file path=word/document.xml><?xml version="1.0" encoding="utf-8"?>
 <w:document xmlns:wpc="http://schemas.microsoft.com/office/word/2010/wordprocessingCanvas" xmlns:cx="http://schemas.microsoft.com/office/drawing/2014/chartex" xmlns:cx1="http://schemas.microsoft.com/office/drawing/2015/9/8/chartex" xmlns:cx2="http://schemas.microsoft.com/office/drawing/2015/10/21/chartex" xmlns:cx3="http://schemas.microsoft.com/office/drawing/2016/5/9/chartex" xmlns:cx4="http://schemas.microsoft.com/office/drawing/2016/5/10/chartex" xmlns:cx5="http://schemas.microsoft.com/office/drawing/2016/5/11/chartex" xmlns:cx6="http://schemas.microsoft.com/office/drawing/2016/5/12/chartex" xmlns:cx7="http://schemas.microsoft.com/office/drawing/2016/5/13/chartex" xmlns:cx8="http://schemas.microsoft.com/office/drawing/2016/5/14/chartex" xmlns:mc="http://schemas.openxmlformats.org/markup-compatibility/2006" xmlns:aink="http://schemas.microsoft.com/office/drawing/2016/ink" xmlns:am3d="http://schemas.microsoft.com/office/drawing/2017/model3d" xmlns:o="urn:schemas-microsoft-com:office:office" xmlns:oel="http://schemas.microsoft.com/office/2019/extlst" xmlns:r="http://schemas.openxmlformats.org/officeDocument/2006/relationships" xmlns:m="http://schemas.openxmlformats.org/officeDocument/2006/math" xmlns:v="urn:schemas-microsoft-com:vml" xmlns:wp14="http://schemas.microsoft.com/office/word/2010/wordprocessingDrawing" xmlns:wp="http://schemas.openxmlformats.org/drawingml/2006/wordprocessingDrawing" xmlns:w10="urn:schemas-microsoft-com:office:word" xmlns:w="http://schemas.openxmlformats.org/wordprocessingml/2006/main" xmlns:w14="http://schemas.microsoft.com/office/word/2010/wordml" xmlns:w15="http://schemas.microsoft.com/office/word/2012/wordml" xmlns:w16cex="http://schemas.microsoft.com/office/word/2018/wordml/cex" xmlns:w16cid="http://schemas.microsoft.com/office/word/2016/wordml/cid" xmlns:w16="http://schemas.microsoft.com/office/word/2018/wordml" xmlns:w16du="http://schemas.microsoft.com/office/word/2023/wordml/word16du" xmlns:w16sdtdh="http://schemas.microsoft.com/office/word/2020/wordml/sdtdatahash" xmlns:w16sdtfl="http://schemas.microsoft.com/office/word/2024/wordml/sdtformatlock" xmlns:w16se="http://schemas.microsoft.com/office/word/2015/wordml/symex" xmlns:wpg="http://schemas.microsoft.com/office/word/2010/wordprocessingGroup" xmlns:wpi="http://schemas.microsoft.com/office/word/2010/wordprocessingInk" xmlns:wne="http://schemas.microsoft.com/office/word/2006/wordml" xmlns:wps="http://schemas.microsoft.com/office/word/2010/wordprocessingShape" mc:Ignorable="w14 w15 w16se w16cid w16 w16cex w16sdtdh w16sdtfl w16du wp14">
   <w:body>
+    <w:p>
+      <w:pPr>
+        <w:spacing w:before="0" w:line="240" w:lineRule="auto"/>
+        <w:jc w:val="center"/>
+        <w:rPr>
+          <w:b/>
+          <w:bCs/>
+          <w:sz w:val="32"/>
+          <w:szCs w:val="32"/>
+          <w:u w:val="single"/>
+        </w:rPr>
+      </w:pPr>
+      <w:r>
+        <w:rPr>
+          <w:b/>
+          <w:bCs/>
+          <w:sz w:val="32"/>
+          <w:szCs w:val="32"/>
+          <w:u w:val="single"/>
+        </w:rPr>
+        <w:t xml:space="preserve">TS </w:t>
+      </w:r>
+      <w:r>
+        <w:rPr>
+          <w:b/>
+          <w:bCs/>
+          <w:sz w:val="32"/>
+          <w:szCs w:val="32"/>
+          <w:u w:val="single"/>
+        </w:rPr>
+        <w:t>Ghanam</w:t>
+      </w:r>
+      <w:r>
+        <w:rPr>
+          <w:b/>
+          <w:bCs/>
+          <w:sz w:val="32"/>
+          <w:szCs w:val="32"/>
+          <w:u w:val="single"/>
+        </w:rPr>
+        <w:t xml:space="preserve"> </w:t>
+      </w:r>
+      <w:r>
+        <w:rPr>
+          <w:b/>
+          <w:bCs/>
+          <w:sz w:val="32"/>
+          <w:szCs w:val="32"/>
+          <w:u w:val="single"/>
+        </w:rPr>
+        <w:t xml:space="preserve">– TS </w:t>
+      </w:r>
+      <w:r>
+        <w:rPr>
+          <w:b/>
+          <w:bCs/>
+          <w:sz w:val="32"/>
+          <w:szCs w:val="32"/>
+          <w:u w:val="single"/>
+        </w:rPr>
+        <w:t>3.5</w:t>
+      </w:r>
+      <w:r>
+        <w:rPr>
+          <w:b/>
+          <w:bCs/>
+          <w:sz w:val="32"/>
+          <w:szCs w:val="32"/>
+          <w:u w:val="single"/>
+        </w:rPr>
+        <w:t xml:space="preserve"> </w:t>
+      </w:r>
+      <w:r>
+        <w:rPr>
+          <w:b/>
+          <w:bCs/>
+          <w:sz w:val="32"/>
+          <w:szCs w:val="32"/>
+          <w:u w:val="single"/>
+        </w:rPr>
+        <w:t>Malayalam</w:t>
+      </w:r>
+      <w:r>
+        <w:rPr>
+          <w:b/>
+          <w:bCs/>
+          <w:sz w:val="32"/>
+          <w:szCs w:val="32"/>
+          <w:u w:val="single"/>
+        </w:rPr>
+        <w:t xml:space="preserve"> Corrections –</w:t>
+      </w:r>
+      <w:r>
+        <w:rPr>
+          <w:b/>
+          <w:bCs/>
+          <w:sz w:val="32"/>
+          <w:szCs w:val="32"/>
+          <w:u w:val="single"/>
+        </w:rPr>
+        <w:t xml:space="preserve"> </w:t>
+      </w:r>
+      <w:r>
+        <w:rPr>
+          <w:b/>
+          <w:bCs/>
+          <w:sz w:val="32"/>
+          <w:szCs w:val="32"/>
+          <w:u w:val="single"/>
+        </w:rPr>
+        <w:t xml:space="preserve">Observed till </w:t>
+      </w:r>
+      <w:r>
+        <w:rPr>
+          <w:b/>
+          <w:bCs/>
+          <w:sz w:val="32"/>
+          <w:szCs w:val="32"/>
+          <w:u w:val="single"/>
+        </w:rPr>
+        <w:t>31st Aug 2026</w:t>
+      </w:r>
+    </w:p>
+    <w:p>
+      <w:pPr>
+        <w:spacing w:before="0" w:line="240" w:lineRule="auto"/>
+        <w:jc w:val="center"/>
+        <w:rPr>
+          <w:b/>
+          <w:bCs/>
+          <w:sz w:val="28"/>
+          <w:szCs w:val="32"/>
+        </w:rPr>
+      </w:pPr>
+      <w:r>
+        <w:rPr>
+          <w:b/>
+          <w:bCs/>
+          <w:sz w:val="28"/>
+          <w:szCs w:val="32"/>
+        </w:rPr>
+        <w:t>(ignore those which are already incorporated in your book’s version and date)</w:t>
+      </w:r>
+    </w:p>
+    <w:tbl>
+      <w:tblPr>
+        <w:tblW w:w="14537" w:type="dxa"/>
+        <w:tblInd w:w="-792" w:type="dxa"/>
+        <w:tblBorders>
+          <w:top w:val="single" w:sz="4" w:space="0" w:color="000000"/>
+          <w:left w:val="single" w:sz="4" w:space="0" w:color="000000"/>
+          <w:bottom w:val="single" w:sz="4" w:space="0" w:color="000000"/>
+          <w:right w:val="single" w:sz="4" w:space="0" w:color="000000"/>
+          <w:insideH w:val="single" w:sz="4" w:space="0" w:color="000000"/>
+          <w:insideV w:val="single" w:sz="4" w:space="0" w:color="000000"/>
+        </w:tblBorders>
+        <w:tblLook w:val="04A0" w:firstRow="1" w:lastRow="0" w:firstColumn="1" w:lastColumn="0" w:noHBand="0" w:noVBand="1"/>
+      </w:tblPr>
+      <w:tblGrid>
+        <w:gridCol w:w="7166"/>
+        <w:gridCol w:w="7371"/>
+      </w:tblGrid>
+      <w:tr>
+        <w:trPr>
+          <w:trHeight w:val="581"/>
+        </w:trPr>
+        <w:tc>
+          <w:tcPr>
+            <w:tcW w:w="7166" w:type="dxa"/>
+            <w:tcBorders>
+              <w:top w:val="single" w:sz="4" w:space="0" w:color="000000"/>
+              <w:left w:val="single" w:sz="4" w:space="0" w:color="000000"/>
+              <w:bottom w:val="single" w:sz="4" w:space="0" w:color="000000"/>
+              <w:right w:val="single" w:sz="4" w:space="0" w:color="000000"/>
+            </w:tcBorders>
+          </w:tcPr>
+          <w:p>
+            <w:pPr>
+              <w:widowControl w:val="0"/>
+              <w:autoSpaceDE w:val="0"/>
+              <w:autoSpaceDN w:val="0"/>
+              <w:adjustRightInd w:val="0"/>
+              <w:spacing w:before="0" w:line="240" w:lineRule="auto"/>
+              <w:rPr>
+                <w:rFonts w:cs="BRH Malayalam Extra"/>
+                <w:b/>
+                <w:bCs/>
+                <w:szCs w:val="40"/>
+              </w:rPr>
+            </w:pPr>
+            <w:r>
+              <w:rPr>
+                <w:rFonts w:cs="BRH Malayalam Extra"/>
+                <w:b/>
+                <w:bCs/>
+                <w:szCs w:val="40"/>
+              </w:rPr>
+              <w:t>None                      None                               None</w:t>
+            </w:r>
+          </w:p>
+        </w:tc>
+        <w:tc>
+          <w:tcPr>
+            <w:tcW w:w="7371" w:type="dxa"/>
+            <w:tcBorders>
+              <w:top w:val="single" w:sz="4" w:space="0" w:color="000000"/>
+              <w:left w:val="single" w:sz="4" w:space="0" w:color="000000"/>
+              <w:bottom w:val="single" w:sz="4" w:space="0" w:color="000000"/>
+              <w:right w:val="single" w:sz="4" w:space="0" w:color="000000"/>
+            </w:tcBorders>
+          </w:tcPr>
+          <w:p>
+            <w:pPr>
+              <w:autoSpaceDE w:val="0"/>
+              <w:autoSpaceDN w:val="0"/>
+              <w:adjustRightInd w:val="0"/>
+              <w:spacing w:before="0" w:line="240" w:lineRule="auto"/>
+              <w:rPr>
+                <w:rFonts w:cs="BRH Malayalam Extra"/>
+                <w:szCs w:val="40"/>
+              </w:rPr>
+            </w:pPr>
+            <w:r>
+              <w:rPr>
+                <w:rFonts w:cs="BRH Malayalam Extra"/>
+                <w:b/>
+                <w:bCs/>
+                <w:szCs w:val="40"/>
+              </w:rPr>
+              <w:t>None                      None                               None</w:t>
+            </w:r>
+          </w:p>
+        </w:tc>
+      </w:tr>
+    </w:tbl>
+    <w:p>
+      <w:pPr>
+        <w:spacing w:before="0" w:line="240" w:lineRule="auto"/>
+        <w:jc w:val="center"/>
+        <w:rPr>
+          <w:b/>
+          <w:bCs/>
+          <w:sz w:val="32"/>
+          <w:szCs w:val="32"/>
+          <w:u w:val="single"/>
+        </w:rPr>
+      </w:pPr>
+      <w:r>
+        <w:rPr>
+          <w:b/>
+          <w:bCs/>
+          <w:sz w:val="32"/>
+          <w:szCs w:val="32"/>
+          <w:u w:val="single"/>
+        </w:rPr>
+        <w:t>===============</w:t>
+      </w:r>
+    </w:p>
+    <w:p>
+      <w:pPr>
+        <w:spacing w:before="0" w:line="240" w:lineRule="auto"/>
+        <w:jc w:val="center"/>
+        <w:rPr>
+          <w:b/>
+          <w:bCs/>
+          <w:sz w:val="32"/>
+          <w:szCs w:val="32"/>
+          <w:u w:val="single"/>
+        </w:rPr>
+      </w:pPr>
+    </w:p>
     <w:p>
       <w:pPr>
         <w:spacing w:before="0" w:line="240" w:lineRule="auto"/>
@@ -285,7 +556,7 @@
       </w:tr>
       <w:tr>
         <w:trPr>
-          <w:trHeight w:val="1183"/>
+          <w:trHeight w:val="517"/>
         </w:trPr>
         <w:tc>
           <w:tcPr>
@@ -1724,13 +1995,30 @@
                 <w:lang w:val="it-IT"/>
               </w:rPr>
             </w:pPr>
-            <w:r>
-              <w:rPr>
-                <w:rFonts w:cs="BRH Malayalam Extra"/>
-                <w:color w:val="000000"/>
-                <w:szCs w:val="32"/>
-                <w:lang w:val="it-IT"/>
-              </w:rPr>
+          </w:p>
+          <w:p>
+            <w:pPr>
+              <w:widowControl w:val="0"/>
+              <w:autoSpaceDE w:val="0"/>
+              <w:autoSpaceDN w:val="0"/>
+              <w:adjustRightInd w:val="0"/>
+              <w:spacing w:before="0" w:line="240" w:lineRule="auto"/>
+              <w:rPr>
+                <w:rFonts w:ascii="BRH Malayalam Extra" w:hAnsi="BRH Malayalam Extra" w:cs="BRH Malayalam Extra"/>
+                <w:color w:val="000000"/>
+                <w:sz w:val="32"/>
+                <w:szCs w:val="32"/>
+                <w:lang w:val="it-IT"/>
+              </w:rPr>
+            </w:pPr>
+            <w:r>
+              <w:rPr>
+                <w:rFonts w:cs="BRH Malayalam Extra"/>
+                <w:color w:val="000000"/>
+                <w:szCs w:val="32"/>
+                <w:lang w:val="it-IT"/>
+              </w:rPr>
+              <w:lastRenderedPageBreak/>
               <w:t>47</w:t>
             </w:r>
             <w:r>
@@ -1992,6 +2280,7 @@
                 <w:szCs w:val="32"/>
                 <w:lang w:val="it-IT"/>
               </w:rPr>
+              <w:lastRenderedPageBreak/>
               <w:t>44</w:t>
             </w:r>
             <w:r>
@@ -3343,13 +3632,30 @@
                 <w:lang w:val="it-IT"/>
               </w:rPr>
             </w:pPr>
-            <w:r>
-              <w:rPr>
-                <w:rFonts w:cs="BRH Malayalam Extra"/>
-                <w:color w:val="000000"/>
-                <w:szCs w:val="32"/>
-                <w:lang w:val="it-IT"/>
-              </w:rPr>
+          </w:p>
+          <w:p>
+            <w:pPr>
+              <w:widowControl w:val="0"/>
+              <w:autoSpaceDE w:val="0"/>
+              <w:autoSpaceDN w:val="0"/>
+              <w:adjustRightInd w:val="0"/>
+              <w:spacing w:before="0" w:line="240" w:lineRule="auto"/>
+              <w:rPr>
+                <w:rFonts w:ascii="BRH Malayalam Extra" w:hAnsi="BRH Malayalam Extra" w:cs="BRH Malayalam Extra"/>
+                <w:color w:val="000000"/>
+                <w:sz w:val="32"/>
+                <w:szCs w:val="32"/>
+                <w:lang w:val="it-IT"/>
+              </w:rPr>
+            </w:pPr>
+            <w:r>
+              <w:rPr>
+                <w:rFonts w:cs="BRH Malayalam Extra"/>
+                <w:color w:val="000000"/>
+                <w:szCs w:val="32"/>
+                <w:lang w:val="it-IT"/>
+              </w:rPr>
+              <w:lastRenderedPageBreak/>
               <w:t>47</w:t>
             </w:r>
             <w:r>
@@ -5798,6 +6104,7 @@
                 <w:color w:val="000000"/>
                 <w:szCs w:val="32"/>
               </w:rPr>
+              <w:lastRenderedPageBreak/>
               <w:t>25</w:t>
             </w:r>
             <w:r>
@@ -6513,43 +6820,12 @@
                 <w:szCs w:val="32"/>
               </w:rPr>
             </w:pPr>
-          </w:p>
-          <w:p>
-            <w:pPr>
-              <w:widowControl w:val="0"/>
-              <w:autoSpaceDE w:val="0"/>
-              <w:autoSpaceDN w:val="0"/>
-              <w:adjustRightInd w:val="0"/>
-              <w:spacing w:before="0" w:line="240" w:lineRule="auto"/>
-              <w:rPr>
-                <w:rFonts w:ascii="BRH Malayalam Extra" w:hAnsi="BRH Malayalam Extra" w:cs="BRH Malayalam Extra"/>
-                <w:color w:val="000000"/>
-                <w:sz w:val="32"/>
-                <w:szCs w:val="32"/>
-              </w:rPr>
-            </w:pPr>
-          </w:p>
-          <w:p>
-            <w:pPr>
-              <w:widowControl w:val="0"/>
-              <w:autoSpaceDE w:val="0"/>
-              <w:autoSpaceDN w:val="0"/>
-              <w:adjustRightInd w:val="0"/>
-              <w:spacing w:before="0" w:line="240" w:lineRule="auto"/>
-              <w:rPr>
-                <w:rFonts w:ascii="BRH Malayalam Extra" w:hAnsi="BRH Malayalam Extra" w:cs="BRH Malayalam Extra"/>
-                <w:color w:val="000000"/>
-                <w:sz w:val="32"/>
-                <w:szCs w:val="32"/>
-              </w:rPr>
-            </w:pPr>
-            <w:r>
-              <w:rPr>
-                <w:rFonts w:cs="BRH Malayalam Extra"/>
-                <w:color w:val="000000"/>
-                <w:szCs w:val="32"/>
-              </w:rPr>
-              <w:lastRenderedPageBreak/>
+            <w:r>
+              <w:rPr>
+                <w:rFonts w:cs="BRH Malayalam Extra"/>
+                <w:color w:val="000000"/>
+                <w:szCs w:val="32"/>
+              </w:rPr>
               <w:t>27</w:t>
             </w:r>
             <w:r>
@@ -7417,7 +7693,6 @@
                 <w:color w:val="000000"/>
                 <w:szCs w:val="32"/>
               </w:rPr>
-              <w:lastRenderedPageBreak/>
               <w:t>25</w:t>
             </w:r>
             <w:r>
@@ -8102,6 +8377,176 @@
                 <w:szCs w:val="32"/>
               </w:rPr>
             </w:pPr>
+            <w:r>
+              <w:rPr>
+                <w:rFonts w:cs="BRH Malayalam Extra"/>
+                <w:color w:val="000000"/>
+                <w:szCs w:val="32"/>
+              </w:rPr>
+              <w:t>27</w:t>
+            </w:r>
+            <w:r>
+              <w:rPr>
+                <w:rFonts w:ascii="BRH Malayalam Extra" w:hAnsi="BRH Malayalam Extra" w:cs="BRH Malayalam Extra"/>
+                <w:color w:val="000000"/>
+                <w:sz w:val="32"/>
+                <w:szCs w:val="32"/>
+              </w:rPr>
+              <w:t>)</w:t>
+            </w:r>
+            <w:r>
+              <w:rPr>
+                <w:rFonts w:ascii="BRH Malayalam Extra" w:hAnsi="BRH Malayalam Extra" w:cs="BRH Malayalam Extra"/>
+                <w:color w:val="000000"/>
+                <w:sz w:val="32"/>
+                <w:szCs w:val="32"/>
+              </w:rPr>
+              <w:tab/>
+            </w:r>
+            <w:r>
+              <w:rPr>
+                <w:rFonts w:cs="BRH Malayalam Extra"/>
+                <w:color w:val="000000"/>
+                <w:szCs w:val="32"/>
+              </w:rPr>
+              <w:t>3</w:t>
+            </w:r>
+            <w:r>
+              <w:rPr>
+                <w:rFonts w:ascii="BRH Malayalam Extra" w:hAnsi="BRH Malayalam Extra" w:cs="BRH Malayalam Extra"/>
+                <w:color w:val="000000"/>
+                <w:sz w:val="32"/>
+                <w:szCs w:val="32"/>
+              </w:rPr>
+              <w:t>.</w:t>
+            </w:r>
+            <w:r>
+              <w:rPr>
+                <w:rFonts w:cs="BRH Malayalam Extra"/>
+                <w:color w:val="000000"/>
+                <w:szCs w:val="32"/>
+              </w:rPr>
+              <w:t>5</w:t>
+            </w:r>
+            <w:r>
+              <w:rPr>
+                <w:rFonts w:ascii="BRH Malayalam Extra" w:hAnsi="BRH Malayalam Extra" w:cs="BRH Malayalam Extra"/>
+                <w:color w:val="000000"/>
+                <w:sz w:val="32"/>
+                <w:szCs w:val="32"/>
+              </w:rPr>
+              <w:t>.</w:t>
+            </w:r>
+            <w:r>
+              <w:rPr>
+                <w:rFonts w:cs="BRH Malayalam Extra"/>
+                <w:color w:val="000000"/>
+                <w:szCs w:val="32"/>
+              </w:rPr>
+              <w:t>1</w:t>
+            </w:r>
+            <w:r>
+              <w:rPr>
+                <w:rFonts w:ascii="BRH Malayalam Extra" w:hAnsi="BRH Malayalam Extra" w:cs="BRH Malayalam Extra"/>
+                <w:color w:val="000000"/>
+                <w:sz w:val="32"/>
+                <w:szCs w:val="32"/>
+              </w:rPr>
+              <w:t>.</w:t>
+            </w:r>
+            <w:r>
+              <w:rPr>
+                <w:rFonts w:cs="BRH Malayalam Extra"/>
+                <w:color w:val="000000"/>
+                <w:szCs w:val="32"/>
+              </w:rPr>
+              <w:t>3</w:t>
+            </w:r>
+            <w:r>
+              <w:rPr>
+                <w:rFonts w:ascii="BRH Malayalam Extra" w:hAnsi="BRH Malayalam Extra" w:cs="BRH Malayalam Extra"/>
+                <w:color w:val="000000"/>
+                <w:sz w:val="32"/>
+                <w:szCs w:val="32"/>
+              </w:rPr>
+              <w:t>(</w:t>
+            </w:r>
+            <w:r>
+              <w:rPr>
+                <w:rFonts w:cs="BRH Malayalam Extra"/>
+                <w:color w:val="000000"/>
+                <w:szCs w:val="32"/>
+              </w:rPr>
+              <w:t>21</w:t>
+            </w:r>
+            <w:r>
+              <w:rPr>
+                <w:rFonts w:ascii="BRH Malayalam Extra" w:hAnsi="BRH Malayalam Extra" w:cs="BRH Malayalam Extra"/>
+                <w:color w:val="000000"/>
+                <w:sz w:val="32"/>
+                <w:szCs w:val="32"/>
+              </w:rPr>
+              <w:t>)- B | m</w:t>
+            </w:r>
+            <w:r>
+              <w:rPr>
+                <w:rFonts w:ascii="BRH Malayalam Extra" w:hAnsi="BRH Malayalam Extra" w:cs="BRH Malayalam Extra"/>
+                <w:color w:val="000000"/>
+                <w:sz w:val="26"/>
+                <w:szCs w:val="32"/>
+                <w:highlight w:val="green"/>
+              </w:rPr>
+              <w:t>–</w:t>
+            </w:r>
+            <w:r>
+              <w:rPr>
+                <w:rFonts w:ascii="BRH Malayalam Extra" w:hAnsi="BRH Malayalam Extra" w:cs="BRH Malayalam Extra"/>
+                <w:color w:val="000000"/>
+                <w:sz w:val="32"/>
+                <w:szCs w:val="32"/>
+                <w:highlight w:val="green"/>
+              </w:rPr>
+              <w:t>¥h</w:t>
+            </w:r>
+            <w:r>
+              <w:rPr>
+                <w:rFonts w:ascii="BRH Malayalam Extra" w:hAnsi="BRH Malayalam Extra" w:cs="BRH Malayalam Extra"/>
+                <w:color w:val="000000"/>
+                <w:sz w:val="26"/>
+                <w:szCs w:val="32"/>
+                <w:highlight w:val="green"/>
+              </w:rPr>
+              <w:t>–</w:t>
+            </w:r>
+            <w:r>
+              <w:rPr>
+                <w:rFonts w:ascii="BRH Malayalam Extra" w:hAnsi="BRH Malayalam Extra" w:cs="BRH Malayalam Extra"/>
+                <w:color w:val="000000"/>
+                <w:sz w:val="32"/>
+                <w:szCs w:val="32"/>
+                <w:highlight w:val="green"/>
+              </w:rPr>
+              <w:t>Z</w:t>
+            </w:r>
+            <w:r>
+              <w:rPr>
+                <w:rFonts w:ascii="BRH Malayalam Extra" w:hAnsi="BRH Malayalam Extra" w:cs="BRH Malayalam Extra"/>
+                <w:color w:val="000000"/>
+                <w:sz w:val="26"/>
+                <w:szCs w:val="32"/>
+                <w:highlight w:val="yellow"/>
+              </w:rPr>
+              <w:t>–</w:t>
+            </w:r>
+            <w:r>
+              <w:rPr>
+                <w:rFonts w:ascii="BRH Malayalam Extra" w:hAnsi="BRH Malayalam Extra" w:cs="BRH Malayalam Extra"/>
+                <w:color w:val="000000"/>
+                <w:sz w:val="32"/>
+                <w:szCs w:val="32"/>
+              </w:rPr>
+              <w:t xml:space="preserve"> | jJ | </w:t>
+            </w:r>
           </w:p>
           <w:p>
             <w:pPr>
@@ -8117,6 +8562,140 @@
                 <w:szCs w:val="32"/>
               </w:rPr>
             </w:pPr>
+            <w:r>
+              <w:rPr>
+                <w:rFonts w:ascii="BRH Malayalam Extra" w:hAnsi="BRH Malayalam Extra" w:cs="BRH Malayalam Extra"/>
+                <w:color w:val="000000"/>
+                <w:sz w:val="32"/>
+                <w:szCs w:val="32"/>
+              </w:rPr>
+              <w:t>B m</w:t>
+            </w:r>
+            <w:r>
+              <w:rPr>
+                <w:rFonts w:ascii="BRH Malayalam Extra" w:hAnsi="BRH Malayalam Extra" w:cs="BRH Malayalam Extra"/>
+                <w:color w:val="000000"/>
+                <w:sz w:val="32"/>
+                <w:szCs w:val="32"/>
+                <w:highlight w:val="green"/>
+              </w:rPr>
+              <w:t>—¥hZ</w:t>
+            </w:r>
+            <w:r>
+              <w:rPr>
+                <w:rFonts w:ascii="BRH Malayalam Extra" w:hAnsi="BRH Malayalam Extra" w:cs="BRH Malayalam Extra"/>
+                <w:color w:val="000000"/>
+                <w:sz w:val="32"/>
+                <w:szCs w:val="32"/>
+              </w:rPr>
+              <w:t xml:space="preserve"> m</w:t>
+            </w:r>
+            <w:r>
+              <w:rPr>
+                <w:rFonts w:ascii="BRH Malayalam Extra" w:hAnsi="BRH Malayalam Extra" w:cs="BRH Malayalam Extra"/>
+                <w:color w:val="000000"/>
+                <w:sz w:val="32"/>
+                <w:szCs w:val="32"/>
+                <w:highlight w:val="green"/>
+              </w:rPr>
+              <w:t>¥h</w:t>
+            </w:r>
+            <w:r>
+              <w:rPr>
+                <w:rFonts w:ascii="BRH Malayalam Extra" w:hAnsi="BRH Malayalam Extra" w:cs="BRH Malayalam Extra"/>
+                <w:color w:val="000000"/>
+                <w:sz w:val="26"/>
+                <w:szCs w:val="32"/>
+                <w:highlight w:val="green"/>
+              </w:rPr>
+              <w:t>–</w:t>
+            </w:r>
+            <w:r>
+              <w:rPr>
+                <w:rFonts w:ascii="BRH Malayalam Extra" w:hAnsi="BRH Malayalam Extra" w:cs="BRH Malayalam Extra"/>
+                <w:color w:val="000000"/>
+                <w:sz w:val="32"/>
+                <w:szCs w:val="32"/>
+                <w:highlight w:val="green"/>
+              </w:rPr>
+              <w:t>Zx</w:t>
+            </w:r>
+            <w:r>
+              <w:rPr>
+                <w:rFonts w:ascii="BRH Malayalam Extra" w:hAnsi="BRH Malayalam Extra" w:cs="BRH Malayalam Extra"/>
+                <w:color w:val="000000"/>
+                <w:sz w:val="32"/>
+                <w:szCs w:val="32"/>
+              </w:rPr>
+              <w:t xml:space="preserve"> m</w:t>
+            </w:r>
+            <w:r>
+              <w:rPr>
+                <w:rFonts w:ascii="BRH Malayalam Extra" w:hAnsi="BRH Malayalam Extra" w:cs="BRH Malayalam Extra"/>
+                <w:color w:val="000000"/>
+                <w:sz w:val="32"/>
+                <w:szCs w:val="32"/>
+                <w:highlight w:val="green"/>
+              </w:rPr>
+              <w:t>—¥hZ</w:t>
+            </w:r>
+            <w:r>
+              <w:rPr>
+                <w:rFonts w:ascii="BRH Malayalam Extra" w:hAnsi="BRH Malayalam Extra" w:cs="BRH Malayalam Extra"/>
+                <w:color w:val="000000"/>
+                <w:sz w:val="26"/>
+                <w:szCs w:val="32"/>
+              </w:rPr>
+              <w:t>–</w:t>
+            </w:r>
+            <w:r>
+              <w:rPr>
+                <w:rFonts w:ascii="BRH Malayalam Extra" w:hAnsi="BRH Malayalam Extra" w:cs="BRH Malayalam Extra"/>
+                <w:color w:val="000000"/>
+                <w:sz w:val="32"/>
+                <w:szCs w:val="32"/>
+              </w:rPr>
+              <w:t xml:space="preserve"> ¥jx ¥jx m</w:t>
+            </w:r>
+            <w:r>
+              <w:rPr>
+                <w:rFonts w:ascii="BRH Malayalam Extra" w:hAnsi="BRH Malayalam Extra" w:cs="BRH Malayalam Extra"/>
+                <w:color w:val="000000"/>
+                <w:sz w:val="32"/>
+                <w:szCs w:val="32"/>
+                <w:highlight w:val="green"/>
+              </w:rPr>
+              <w:t>—¥h</w:t>
+            </w:r>
+            <w:r>
+              <w:rPr>
+                <w:rFonts w:ascii="BRH Malayalam Extra" w:hAnsi="BRH Malayalam Extra" w:cs="BRH Malayalam Extra"/>
+                <w:color w:val="000000"/>
+                <w:sz w:val="26"/>
+                <w:szCs w:val="32"/>
+                <w:highlight w:val="green"/>
+              </w:rPr>
+              <w:t>–</w:t>
+            </w:r>
+            <w:r>
+              <w:rPr>
+                <w:rFonts w:ascii="BRH Malayalam Extra" w:hAnsi="BRH Malayalam Extra" w:cs="BRH Malayalam Extra"/>
+                <w:color w:val="000000"/>
+                <w:sz w:val="32"/>
+                <w:szCs w:val="32"/>
+                <w:highlight w:val="green"/>
+              </w:rPr>
+              <w:t>Zx</w:t>
+            </w:r>
+            <w:r>
+              <w:rPr>
+                <w:rFonts w:ascii="BRH Malayalam Extra" w:hAnsi="BRH Malayalam Extra" w:cs="BRH Malayalam Extra"/>
+                <w:color w:val="000000"/>
+                <w:sz w:val="32"/>
+                <w:szCs w:val="32"/>
+              </w:rPr>
+              <w:t xml:space="preserve"> </w:t>
+            </w:r>
           </w:p>
           <w:p>
             <w:pPr>
@@ -8134,155 +8713,22 @@
             </w:pPr>
             <w:r>
               <w:rPr>
-                <w:rFonts w:cs="BRH Malayalam Extra"/>
-                <w:color w:val="000000"/>
-                <w:szCs w:val="32"/>
-              </w:rPr>
-              <w:lastRenderedPageBreak/>
-              <w:t>27</w:t>
-            </w:r>
-            <w:r>
-              <w:rPr>
-                <w:rFonts w:ascii="BRH Malayalam Extra" w:hAnsi="BRH Malayalam Extra" w:cs="BRH Malayalam Extra"/>
-                <w:color w:val="000000"/>
-                <w:sz w:val="32"/>
-                <w:szCs w:val="32"/>
-              </w:rPr>
-              <w:t>)</w:t>
-            </w:r>
-            <w:r>
-              <w:rPr>
-                <w:rFonts w:ascii="BRH Malayalam Extra" w:hAnsi="BRH Malayalam Extra" w:cs="BRH Malayalam Extra"/>
-                <w:color w:val="000000"/>
-                <w:sz w:val="32"/>
-                <w:szCs w:val="32"/>
-              </w:rPr>
-              <w:tab/>
-            </w:r>
-            <w:r>
-              <w:rPr>
-                <w:rFonts w:cs="BRH Malayalam Extra"/>
-                <w:color w:val="000000"/>
-                <w:szCs w:val="32"/>
-              </w:rPr>
-              <w:t>3</w:t>
-            </w:r>
-            <w:r>
-              <w:rPr>
-                <w:rFonts w:ascii="BRH Malayalam Extra" w:hAnsi="BRH Malayalam Extra" w:cs="BRH Malayalam Extra"/>
-                <w:color w:val="000000"/>
-                <w:sz w:val="32"/>
-                <w:szCs w:val="32"/>
-              </w:rPr>
-              <w:t>.</w:t>
-            </w:r>
-            <w:r>
-              <w:rPr>
-                <w:rFonts w:cs="BRH Malayalam Extra"/>
-                <w:color w:val="000000"/>
-                <w:szCs w:val="32"/>
-              </w:rPr>
-              <w:t>5</w:t>
-            </w:r>
-            <w:r>
-              <w:rPr>
-                <w:rFonts w:ascii="BRH Malayalam Extra" w:hAnsi="BRH Malayalam Extra" w:cs="BRH Malayalam Extra"/>
-                <w:color w:val="000000"/>
-                <w:sz w:val="32"/>
-                <w:szCs w:val="32"/>
-              </w:rPr>
-              <w:t>.</w:t>
-            </w:r>
-            <w:r>
-              <w:rPr>
-                <w:rFonts w:cs="BRH Malayalam Extra"/>
-                <w:color w:val="000000"/>
-                <w:szCs w:val="32"/>
-              </w:rPr>
-              <w:t>1</w:t>
-            </w:r>
-            <w:r>
-              <w:rPr>
-                <w:rFonts w:ascii="BRH Malayalam Extra" w:hAnsi="BRH Malayalam Extra" w:cs="BRH Malayalam Extra"/>
-                <w:color w:val="000000"/>
-                <w:sz w:val="32"/>
-                <w:szCs w:val="32"/>
-              </w:rPr>
-              <w:t>.</w:t>
-            </w:r>
-            <w:r>
-              <w:rPr>
-                <w:rFonts w:cs="BRH Malayalam Extra"/>
-                <w:color w:val="000000"/>
-                <w:szCs w:val="32"/>
-              </w:rPr>
-              <w:t>3</w:t>
-            </w:r>
-            <w:r>
-              <w:rPr>
-                <w:rFonts w:ascii="BRH Malayalam Extra" w:hAnsi="BRH Malayalam Extra" w:cs="BRH Malayalam Extra"/>
-                <w:color w:val="000000"/>
-                <w:sz w:val="32"/>
-                <w:szCs w:val="32"/>
-              </w:rPr>
-              <w:t>(</w:t>
-            </w:r>
-            <w:r>
-              <w:rPr>
-                <w:rFonts w:cs="BRH Malayalam Extra"/>
-                <w:color w:val="000000"/>
-                <w:szCs w:val="32"/>
-              </w:rPr>
-              <w:t>21</w:t>
-            </w:r>
-            <w:r>
-              <w:rPr>
-                <w:rFonts w:ascii="BRH Malayalam Extra" w:hAnsi="BRH Malayalam Extra" w:cs="BRH Malayalam Extra"/>
-                <w:color w:val="000000"/>
-                <w:sz w:val="32"/>
-                <w:szCs w:val="32"/>
-              </w:rPr>
-              <w:t>)- B | m</w:t>
-            </w:r>
-            <w:r>
-              <w:rPr>
-                <w:rFonts w:ascii="BRH Malayalam Extra" w:hAnsi="BRH Malayalam Extra" w:cs="BRH Malayalam Extra"/>
-                <w:color w:val="000000"/>
-                <w:sz w:val="26"/>
+                <w:rFonts w:ascii="BRH Malayalam Extra" w:hAnsi="BRH Malayalam Extra" w:cs="BRH Malayalam Extra"/>
+                <w:color w:val="000000"/>
+                <w:sz w:val="32"/>
+                <w:szCs w:val="32"/>
+              </w:rPr>
+              <w:t>m</w:t>
+            </w:r>
+            <w:r>
+              <w:rPr>
+                <w:rFonts w:ascii="BRH Malayalam Extra" w:hAnsi="BRH Malayalam Extra" w:cs="BRH Malayalam Extra"/>
+                <w:color w:val="000000"/>
+                <w:sz w:val="32"/>
                 <w:szCs w:val="32"/>
                 <w:highlight w:val="green"/>
               </w:rPr>
-              <w:t>–</w:t>
-            </w:r>
-            <w:r>
-              <w:rPr>
-                <w:rFonts w:ascii="BRH Malayalam Extra" w:hAnsi="BRH Malayalam Extra" w:cs="BRH Malayalam Extra"/>
-                <w:color w:val="000000"/>
-                <w:sz w:val="32"/>
-                <w:szCs w:val="32"/>
-                <w:highlight w:val="green"/>
-              </w:rPr>
-              <w:t>¥h</w:t>
-            </w:r>
-            <w:r>
-              <w:rPr>
-                <w:rFonts w:ascii="BRH Malayalam Extra" w:hAnsi="BRH Malayalam Extra" w:cs="BRH Malayalam Extra"/>
-                <w:color w:val="000000"/>
-                <w:sz w:val="26"/>
-                <w:szCs w:val="32"/>
-                <w:highlight w:val="green"/>
-              </w:rPr>
-              <w:t>–</w:t>
-            </w:r>
-            <w:r>
-              <w:rPr>
-                <w:rFonts w:ascii="BRH Malayalam Extra" w:hAnsi="BRH Malayalam Extra" w:cs="BRH Malayalam Extra"/>
-                <w:color w:val="000000"/>
-                <w:sz w:val="32"/>
-                <w:szCs w:val="32"/>
-                <w:highlight w:val="green"/>
-              </w:rPr>
-              <w:t>Z</w:t>
+              <w:t>—¥hZ</w:t>
             </w:r>
             <w:r>
               <w:rPr>
@@ -8301,7 +8747,7 @@
                 <w:sz w:val="32"/>
                 <w:szCs w:val="32"/>
               </w:rPr>
-              <w:t xml:space="preserve"> | jJ | </w:t>
+              <w:t xml:space="preserve"> jJ | </w:t>
             </w:r>
           </w:p>
           <w:p>
@@ -8320,31 +8766,124 @@
             </w:pPr>
             <w:r>
               <w:rPr>
-                <w:rFonts w:ascii="BRH Malayalam Extra" w:hAnsi="BRH Malayalam Extra" w:cs="BRH Malayalam Extra"/>
-                <w:color w:val="000000"/>
-                <w:sz w:val="32"/>
-                <w:szCs w:val="32"/>
-              </w:rPr>
-              <w:t>B m</w:t>
-            </w:r>
-            <w:r>
-              <w:rPr>
-                <w:rFonts w:ascii="BRH Malayalam Extra" w:hAnsi="BRH Malayalam Extra" w:cs="BRH Malayalam Extra"/>
-                <w:color w:val="000000"/>
-                <w:sz w:val="32"/>
+                <w:rFonts w:cs="BRH Malayalam Extra"/>
+                <w:color w:val="000000"/>
+                <w:szCs w:val="32"/>
+              </w:rPr>
+              <w:t>28</w:t>
+            </w:r>
+            <w:r>
+              <w:rPr>
+                <w:rFonts w:ascii="BRH Malayalam Extra" w:hAnsi="BRH Malayalam Extra" w:cs="BRH Malayalam Extra"/>
+                <w:color w:val="000000"/>
+                <w:sz w:val="32"/>
+                <w:szCs w:val="32"/>
+              </w:rPr>
+              <w:t>)</w:t>
+            </w:r>
+            <w:r>
+              <w:rPr>
+                <w:rFonts w:ascii="BRH Malayalam Extra" w:hAnsi="BRH Malayalam Extra" w:cs="BRH Malayalam Extra"/>
+                <w:color w:val="000000"/>
+                <w:sz w:val="32"/>
+                <w:szCs w:val="32"/>
+              </w:rPr>
+              <w:tab/>
+            </w:r>
+            <w:r>
+              <w:rPr>
+                <w:rFonts w:cs="BRH Malayalam Extra"/>
+                <w:color w:val="000000"/>
+                <w:szCs w:val="32"/>
+              </w:rPr>
+              <w:t>3</w:t>
+            </w:r>
+            <w:r>
+              <w:rPr>
+                <w:rFonts w:ascii="BRH Malayalam Extra" w:hAnsi="BRH Malayalam Extra" w:cs="BRH Malayalam Extra"/>
+                <w:color w:val="000000"/>
+                <w:sz w:val="32"/>
+                <w:szCs w:val="32"/>
+              </w:rPr>
+              <w:t>.</w:t>
+            </w:r>
+            <w:r>
+              <w:rPr>
+                <w:rFonts w:cs="BRH Malayalam Extra"/>
+                <w:color w:val="000000"/>
+                <w:szCs w:val="32"/>
+              </w:rPr>
+              <w:t>5</w:t>
+            </w:r>
+            <w:r>
+              <w:rPr>
+                <w:rFonts w:ascii="BRH Malayalam Extra" w:hAnsi="BRH Malayalam Extra" w:cs="BRH Malayalam Extra"/>
+                <w:color w:val="000000"/>
+                <w:sz w:val="32"/>
+                <w:szCs w:val="32"/>
+              </w:rPr>
+              <w:t>.</w:t>
+            </w:r>
+            <w:r>
+              <w:rPr>
+                <w:rFonts w:cs="BRH Malayalam Extra"/>
+                <w:color w:val="000000"/>
+                <w:szCs w:val="32"/>
+              </w:rPr>
+              <w:t>1</w:t>
+            </w:r>
+            <w:r>
+              <w:rPr>
+                <w:rFonts w:ascii="BRH Malayalam Extra" w:hAnsi="BRH Malayalam Extra" w:cs="BRH Malayalam Extra"/>
+                <w:color w:val="000000"/>
+                <w:sz w:val="32"/>
+                <w:szCs w:val="32"/>
+              </w:rPr>
+              <w:t>.</w:t>
+            </w:r>
+            <w:r>
+              <w:rPr>
+                <w:rFonts w:cs="BRH Malayalam Extra"/>
+                <w:color w:val="000000"/>
+                <w:szCs w:val="32"/>
+              </w:rPr>
+              <w:t>3</w:t>
+            </w:r>
+            <w:r>
+              <w:rPr>
+                <w:rFonts w:ascii="BRH Malayalam Extra" w:hAnsi="BRH Malayalam Extra" w:cs="BRH Malayalam Extra"/>
+                <w:color w:val="000000"/>
+                <w:sz w:val="32"/>
+                <w:szCs w:val="32"/>
+              </w:rPr>
+              <w:t>(</w:t>
+            </w:r>
+            <w:r>
+              <w:rPr>
+                <w:rFonts w:cs="BRH Malayalam Extra"/>
+                <w:color w:val="000000"/>
+                <w:szCs w:val="32"/>
+              </w:rPr>
+              <w:t>22</w:t>
+            </w:r>
+            <w:r>
+              <w:rPr>
+                <w:rFonts w:ascii="BRH Malayalam Extra" w:hAnsi="BRH Malayalam Extra" w:cs="BRH Malayalam Extra"/>
+                <w:color w:val="000000"/>
+                <w:sz w:val="32"/>
+                <w:szCs w:val="32"/>
+              </w:rPr>
+              <w:t>)- m</w:t>
+            </w:r>
+            <w:r>
+              <w:rPr>
+                <w:rFonts w:ascii="BRH Malayalam Extra" w:hAnsi="BRH Malayalam Extra" w:cs="BRH Malayalam Extra"/>
+                <w:color w:val="000000"/>
+                <w:sz w:val="26"/>
                 <w:szCs w:val="32"/>
                 <w:highlight w:val="green"/>
               </w:rPr>
-              <w:t>—¥hZ</w:t>
-            </w:r>
-            <w:r>
-              <w:rPr>
-                <w:rFonts w:ascii="BRH Malayalam Extra" w:hAnsi="BRH Malayalam Extra" w:cs="BRH Malayalam Extra"/>
-                <w:color w:val="000000"/>
-                <w:sz w:val="32"/>
-                <w:szCs w:val="32"/>
-              </w:rPr>
-              <w:t xml:space="preserve"> m</w:t>
+              <w:t>–</w:t>
             </w:r>
             <w:r>
               <w:rPr>
@@ -8374,83 +8913,80 @@
                 <w:szCs w:val="32"/>
                 <w:highlight w:val="green"/>
               </w:rPr>
-              <w:t>Zx</w:t>
-            </w:r>
-            <w:r>
-              <w:rPr>
-                <w:rFonts w:ascii="BRH Malayalam Extra" w:hAnsi="BRH Malayalam Extra" w:cs="BRH Malayalam Extra"/>
-                <w:color w:val="000000"/>
-                <w:sz w:val="32"/>
-                <w:szCs w:val="32"/>
-              </w:rPr>
-              <w:t xml:space="preserve"> m</w:t>
-            </w:r>
-            <w:r>
-              <w:rPr>
-                <w:rFonts w:ascii="BRH Malayalam Extra" w:hAnsi="BRH Malayalam Extra" w:cs="BRH Malayalam Extra"/>
-                <w:color w:val="000000"/>
-                <w:sz w:val="32"/>
-                <w:szCs w:val="32"/>
-                <w:highlight w:val="green"/>
-              </w:rPr>
-              <w:t>—¥hZ</w:t>
-            </w:r>
-            <w:r>
-              <w:rPr>
-                <w:rFonts w:ascii="BRH Malayalam Extra" w:hAnsi="BRH Malayalam Extra" w:cs="BRH Malayalam Extra"/>
-                <w:color w:val="000000"/>
-                <w:sz w:val="26"/>
-                <w:szCs w:val="32"/>
-              </w:rPr>
-              <w:t>–</w:t>
-            </w:r>
-            <w:r>
-              <w:rPr>
-                <w:rFonts w:ascii="BRH Malayalam Extra" w:hAnsi="BRH Malayalam Extra" w:cs="BRH Malayalam Extra"/>
-                <w:color w:val="000000"/>
-                <w:sz w:val="32"/>
-                <w:szCs w:val="32"/>
-              </w:rPr>
-              <w:t xml:space="preserve"> ¥jx ¥jx m</w:t>
-            </w:r>
-            <w:r>
-              <w:rPr>
-                <w:rFonts w:ascii="BRH Malayalam Extra" w:hAnsi="BRH Malayalam Extra" w:cs="BRH Malayalam Extra"/>
-                <w:color w:val="000000"/>
-                <w:sz w:val="32"/>
-                <w:szCs w:val="32"/>
-                <w:highlight w:val="green"/>
-              </w:rPr>
-              <w:t>—¥h</w:t>
-            </w:r>
-            <w:r>
-              <w:rPr>
-                <w:rFonts w:ascii="BRH Malayalam Extra" w:hAnsi="BRH Malayalam Extra" w:cs="BRH Malayalam Extra"/>
-                <w:color w:val="000000"/>
-                <w:sz w:val="26"/>
-                <w:szCs w:val="32"/>
-                <w:highlight w:val="green"/>
-              </w:rPr>
-              <w:t>–</w:t>
-            </w:r>
-            <w:r>
-              <w:rPr>
-                <w:rFonts w:ascii="BRH Malayalam Extra" w:hAnsi="BRH Malayalam Extra" w:cs="BRH Malayalam Extra"/>
-                <w:color w:val="000000"/>
-                <w:sz w:val="32"/>
-                <w:szCs w:val="32"/>
-                <w:highlight w:val="green"/>
-              </w:rPr>
-              <w:t>Zx</w:t>
-            </w:r>
-            <w:r>
-              <w:rPr>
-                <w:rFonts w:ascii="BRH Malayalam Extra" w:hAnsi="BRH Malayalam Extra" w:cs="BRH Malayalam Extra"/>
-                <w:color w:val="000000"/>
-                <w:sz w:val="32"/>
-                <w:szCs w:val="32"/>
-              </w:rPr>
-              <w:t xml:space="preserve"> </w:t>
+              <w:t>Z</w:t>
+            </w:r>
+            <w:r>
+              <w:rPr>
+                <w:rFonts w:ascii="BRH Malayalam Extra" w:hAnsi="BRH Malayalam Extra" w:cs="BRH Malayalam Extra"/>
+                <w:color w:val="000000"/>
+                <w:sz w:val="26"/>
+                <w:szCs w:val="32"/>
+                <w:highlight w:val="yellow"/>
+              </w:rPr>
+              <w:t>–</w:t>
+            </w:r>
+            <w:r>
+              <w:rPr>
+                <w:rFonts w:ascii="BRH Malayalam Extra" w:hAnsi="BRH Malayalam Extra" w:cs="BRH Malayalam Extra"/>
+                <w:color w:val="000000"/>
+                <w:sz w:val="32"/>
+                <w:szCs w:val="32"/>
+              </w:rPr>
+              <w:t xml:space="preserve"> | jJ | G</w:t>
+            </w:r>
+            <w:r>
+              <w:rPr>
+                <w:rFonts w:ascii="BRH Malayalam Extra" w:hAnsi="BRH Malayalam Extra" w:cs="BRH Malayalam Extra"/>
+                <w:color w:val="000000"/>
+                <w:sz w:val="26"/>
+                <w:szCs w:val="32"/>
+              </w:rPr>
+              <w:t>–</w:t>
+            </w:r>
+            <w:r>
+              <w:rPr>
+                <w:rFonts w:ascii="BRH Malayalam Extra" w:hAnsi="BRH Malayalam Extra" w:cs="BRH Malayalam Extra"/>
+                <w:color w:val="000000"/>
+                <w:sz w:val="32"/>
+                <w:szCs w:val="32"/>
+              </w:rPr>
+              <w:t>d</w:t>
+            </w:r>
+            <w:r>
+              <w:rPr>
+                <w:rFonts w:ascii="BRH Malayalam Extra" w:hAnsi="BRH Malayalam Extra" w:cs="BRH Malayalam Extra"/>
+                <w:color w:val="000000"/>
+                <w:sz w:val="26"/>
+                <w:szCs w:val="32"/>
+              </w:rPr>
+              <w:t>–</w:t>
+            </w:r>
+            <w:r>
+              <w:rPr>
+                <w:rFonts w:ascii="BRH Malayalam Extra" w:hAnsi="BRH Malayalam Extra" w:cs="BRH Malayalam Extra"/>
+                <w:color w:val="000000"/>
+                <w:sz w:val="32"/>
+                <w:szCs w:val="32"/>
+              </w:rPr>
+              <w:t>¥jx</w:t>
+            </w:r>
+            <w:r>
+              <w:rPr>
+                <w:rFonts w:ascii="BRH Malayalam Extra" w:hAnsi="BRH Malayalam Extra" w:cs="BRH Malayalam Extra"/>
+                <w:color w:val="000000"/>
+                <w:sz w:val="26"/>
+                <w:szCs w:val="32"/>
+              </w:rPr>
+              <w:t>–</w:t>
+            </w:r>
+            <w:r>
+              <w:rPr>
+                <w:rFonts w:ascii="BRH Malayalam Extra" w:hAnsi="BRH Malayalam Extra" w:cs="BRH Malayalam Extra"/>
+                <w:color w:val="000000"/>
+                <w:sz w:val="32"/>
+                <w:szCs w:val="32"/>
+              </w:rPr>
+              <w:t xml:space="preserve">J | </w:t>
             </w:r>
           </w:p>
           <w:p>
@@ -8461,298 +8997,6 @@
               <w:adjustRightInd w:val="0"/>
               <w:spacing w:before="0" w:line="240" w:lineRule="auto"/>
               <w:rPr>
-                <w:rFonts w:ascii="BRH Malayalam Extra" w:hAnsi="BRH Malayalam Extra" w:cs="BRH Malayalam Extra"/>
-                <w:color w:val="000000"/>
-                <w:sz w:val="32"/>
-                <w:szCs w:val="32"/>
-              </w:rPr>
-            </w:pPr>
-            <w:r>
-              <w:rPr>
-                <w:rFonts w:ascii="BRH Malayalam Extra" w:hAnsi="BRH Malayalam Extra" w:cs="BRH Malayalam Extra"/>
-                <w:color w:val="000000"/>
-                <w:sz w:val="32"/>
-                <w:szCs w:val="32"/>
-              </w:rPr>
-              <w:t>m</w:t>
-            </w:r>
-            <w:r>
-              <w:rPr>
-                <w:rFonts w:ascii="BRH Malayalam Extra" w:hAnsi="BRH Malayalam Extra" w:cs="BRH Malayalam Extra"/>
-                <w:color w:val="000000"/>
-                <w:sz w:val="32"/>
-                <w:szCs w:val="32"/>
-                <w:highlight w:val="green"/>
-              </w:rPr>
-              <w:t>—¥hZ</w:t>
-            </w:r>
-            <w:r>
-              <w:rPr>
-                <w:rFonts w:ascii="BRH Malayalam Extra" w:hAnsi="BRH Malayalam Extra" w:cs="BRH Malayalam Extra"/>
-                <w:color w:val="000000"/>
-                <w:sz w:val="26"/>
-                <w:szCs w:val="32"/>
-                <w:highlight w:val="yellow"/>
-              </w:rPr>
-              <w:t>–</w:t>
-            </w:r>
-            <w:r>
-              <w:rPr>
-                <w:rFonts w:ascii="BRH Malayalam Extra" w:hAnsi="BRH Malayalam Extra" w:cs="BRH Malayalam Extra"/>
-                <w:color w:val="000000"/>
-                <w:sz w:val="32"/>
-                <w:szCs w:val="32"/>
-              </w:rPr>
-              <w:t xml:space="preserve"> jJ | </w:t>
-            </w:r>
-          </w:p>
-          <w:p>
-            <w:pPr>
-              <w:widowControl w:val="0"/>
-              <w:autoSpaceDE w:val="0"/>
-              <w:autoSpaceDN w:val="0"/>
-              <w:adjustRightInd w:val="0"/>
-              <w:spacing w:before="0" w:line="240" w:lineRule="auto"/>
-              <w:rPr>
-                <w:rFonts w:ascii="BRH Malayalam Extra" w:hAnsi="BRH Malayalam Extra" w:cs="BRH Malayalam Extra"/>
-                <w:color w:val="000000"/>
-                <w:sz w:val="32"/>
-                <w:szCs w:val="32"/>
-              </w:rPr>
-            </w:pPr>
-            <w:r>
-              <w:rPr>
-                <w:rFonts w:cs="BRH Malayalam Extra"/>
-                <w:color w:val="000000"/>
-                <w:szCs w:val="32"/>
-              </w:rPr>
-              <w:t>28</w:t>
-            </w:r>
-            <w:r>
-              <w:rPr>
-                <w:rFonts w:ascii="BRH Malayalam Extra" w:hAnsi="BRH Malayalam Extra" w:cs="BRH Malayalam Extra"/>
-                <w:color w:val="000000"/>
-                <w:sz w:val="32"/>
-                <w:szCs w:val="32"/>
-              </w:rPr>
-              <w:t>)</w:t>
-            </w:r>
-            <w:r>
-              <w:rPr>
-                <w:rFonts w:ascii="BRH Malayalam Extra" w:hAnsi="BRH Malayalam Extra" w:cs="BRH Malayalam Extra"/>
-                <w:color w:val="000000"/>
-                <w:sz w:val="32"/>
-                <w:szCs w:val="32"/>
-              </w:rPr>
-              <w:tab/>
-            </w:r>
-            <w:r>
-              <w:rPr>
-                <w:rFonts w:cs="BRH Malayalam Extra"/>
-                <w:color w:val="000000"/>
-                <w:szCs w:val="32"/>
-              </w:rPr>
-              <w:t>3</w:t>
-            </w:r>
-            <w:r>
-              <w:rPr>
-                <w:rFonts w:ascii="BRH Malayalam Extra" w:hAnsi="BRH Malayalam Extra" w:cs="BRH Malayalam Extra"/>
-                <w:color w:val="000000"/>
-                <w:sz w:val="32"/>
-                <w:szCs w:val="32"/>
-              </w:rPr>
-              <w:t>.</w:t>
-            </w:r>
-            <w:r>
-              <w:rPr>
-                <w:rFonts w:cs="BRH Malayalam Extra"/>
-                <w:color w:val="000000"/>
-                <w:szCs w:val="32"/>
-              </w:rPr>
-              <w:t>5</w:t>
-            </w:r>
-            <w:r>
-              <w:rPr>
-                <w:rFonts w:ascii="BRH Malayalam Extra" w:hAnsi="BRH Malayalam Extra" w:cs="BRH Malayalam Extra"/>
-                <w:color w:val="000000"/>
-                <w:sz w:val="32"/>
-                <w:szCs w:val="32"/>
-              </w:rPr>
-              <w:t>.</w:t>
-            </w:r>
-            <w:r>
-              <w:rPr>
-                <w:rFonts w:cs="BRH Malayalam Extra"/>
-                <w:color w:val="000000"/>
-                <w:szCs w:val="32"/>
-              </w:rPr>
-              <w:t>1</w:t>
-            </w:r>
-            <w:r>
-              <w:rPr>
-                <w:rFonts w:ascii="BRH Malayalam Extra" w:hAnsi="BRH Malayalam Extra" w:cs="BRH Malayalam Extra"/>
-                <w:color w:val="000000"/>
-                <w:sz w:val="32"/>
-                <w:szCs w:val="32"/>
-              </w:rPr>
-              <w:t>.</w:t>
-            </w:r>
-            <w:r>
-              <w:rPr>
-                <w:rFonts w:cs="BRH Malayalam Extra"/>
-                <w:color w:val="000000"/>
-                <w:szCs w:val="32"/>
-              </w:rPr>
-              <w:t>3</w:t>
-            </w:r>
-            <w:r>
-              <w:rPr>
-                <w:rFonts w:ascii="BRH Malayalam Extra" w:hAnsi="BRH Malayalam Extra" w:cs="BRH Malayalam Extra"/>
-                <w:color w:val="000000"/>
-                <w:sz w:val="32"/>
-                <w:szCs w:val="32"/>
-              </w:rPr>
-              <w:t>(</w:t>
-            </w:r>
-            <w:r>
-              <w:rPr>
-                <w:rFonts w:cs="BRH Malayalam Extra"/>
-                <w:color w:val="000000"/>
-                <w:szCs w:val="32"/>
-              </w:rPr>
-              <w:t>22</w:t>
-            </w:r>
-            <w:r>
-              <w:rPr>
-                <w:rFonts w:ascii="BRH Malayalam Extra" w:hAnsi="BRH Malayalam Extra" w:cs="BRH Malayalam Extra"/>
-                <w:color w:val="000000"/>
-                <w:sz w:val="32"/>
-                <w:szCs w:val="32"/>
-              </w:rPr>
-              <w:t>)- m</w:t>
-            </w:r>
-            <w:r>
-              <w:rPr>
-                <w:rFonts w:ascii="BRH Malayalam Extra" w:hAnsi="BRH Malayalam Extra" w:cs="BRH Malayalam Extra"/>
-                <w:color w:val="000000"/>
-                <w:sz w:val="26"/>
-                <w:szCs w:val="32"/>
-                <w:highlight w:val="green"/>
-              </w:rPr>
-              <w:t>–</w:t>
-            </w:r>
-            <w:r>
-              <w:rPr>
-                <w:rFonts w:ascii="BRH Malayalam Extra" w:hAnsi="BRH Malayalam Extra" w:cs="BRH Malayalam Extra"/>
-                <w:color w:val="000000"/>
-                <w:sz w:val="32"/>
-                <w:szCs w:val="32"/>
-                <w:highlight w:val="green"/>
-              </w:rPr>
-              <w:t>¥h</w:t>
-            </w:r>
-            <w:r>
-              <w:rPr>
-                <w:rFonts w:ascii="BRH Malayalam Extra" w:hAnsi="BRH Malayalam Extra" w:cs="BRH Malayalam Extra"/>
-                <w:color w:val="000000"/>
-                <w:sz w:val="26"/>
-                <w:szCs w:val="32"/>
-                <w:highlight w:val="green"/>
-              </w:rPr>
-              <w:t>–</w:t>
-            </w:r>
-            <w:r>
-              <w:rPr>
-                <w:rFonts w:ascii="BRH Malayalam Extra" w:hAnsi="BRH Malayalam Extra" w:cs="BRH Malayalam Extra"/>
-                <w:color w:val="000000"/>
-                <w:sz w:val="32"/>
-                <w:szCs w:val="32"/>
-                <w:highlight w:val="green"/>
-              </w:rPr>
-              <w:t>Z</w:t>
-            </w:r>
-            <w:r>
-              <w:rPr>
-                <w:rFonts w:ascii="BRH Malayalam Extra" w:hAnsi="BRH Malayalam Extra" w:cs="BRH Malayalam Extra"/>
-                <w:color w:val="000000"/>
-                <w:sz w:val="26"/>
-                <w:szCs w:val="32"/>
-                <w:highlight w:val="yellow"/>
-              </w:rPr>
-              <w:t>–</w:t>
-            </w:r>
-            <w:r>
-              <w:rPr>
-                <w:rFonts w:ascii="BRH Malayalam Extra" w:hAnsi="BRH Malayalam Extra" w:cs="BRH Malayalam Extra"/>
-                <w:color w:val="000000"/>
-                <w:sz w:val="32"/>
-                <w:szCs w:val="32"/>
-              </w:rPr>
-              <w:t xml:space="preserve"> | jJ | G</w:t>
-            </w:r>
-            <w:r>
-              <w:rPr>
-                <w:rFonts w:ascii="BRH Malayalam Extra" w:hAnsi="BRH Malayalam Extra" w:cs="BRH Malayalam Extra"/>
-                <w:color w:val="000000"/>
-                <w:sz w:val="26"/>
-                <w:szCs w:val="32"/>
-              </w:rPr>
-              <w:t>–</w:t>
-            </w:r>
-            <w:r>
-              <w:rPr>
-                <w:rFonts w:ascii="BRH Malayalam Extra" w:hAnsi="BRH Malayalam Extra" w:cs="BRH Malayalam Extra"/>
-                <w:color w:val="000000"/>
-                <w:sz w:val="32"/>
-                <w:szCs w:val="32"/>
-              </w:rPr>
-              <w:t>d</w:t>
-            </w:r>
-            <w:r>
-              <w:rPr>
-                <w:rFonts w:ascii="BRH Malayalam Extra" w:hAnsi="BRH Malayalam Extra" w:cs="BRH Malayalam Extra"/>
-                <w:color w:val="000000"/>
-                <w:sz w:val="26"/>
-                <w:szCs w:val="32"/>
-              </w:rPr>
-              <w:t>–</w:t>
-            </w:r>
-            <w:r>
-              <w:rPr>
-                <w:rFonts w:ascii="BRH Malayalam Extra" w:hAnsi="BRH Malayalam Extra" w:cs="BRH Malayalam Extra"/>
-                <w:color w:val="000000"/>
-                <w:sz w:val="32"/>
-                <w:szCs w:val="32"/>
-              </w:rPr>
-              <w:t>¥jx</w:t>
-            </w:r>
-            <w:r>
-              <w:rPr>
-                <w:rFonts w:ascii="BRH Malayalam Extra" w:hAnsi="BRH Malayalam Extra" w:cs="BRH Malayalam Extra"/>
-                <w:color w:val="000000"/>
-                <w:sz w:val="26"/>
-                <w:szCs w:val="32"/>
-              </w:rPr>
-              <w:t>–</w:t>
-            </w:r>
-            <w:r>
-              <w:rPr>
-                <w:rFonts w:ascii="BRH Malayalam Extra" w:hAnsi="BRH Malayalam Extra" w:cs="BRH Malayalam Extra"/>
-                <w:color w:val="000000"/>
-                <w:sz w:val="32"/>
-                <w:szCs w:val="32"/>
-              </w:rPr>
-              <w:t xml:space="preserve">J | </w:t>
-            </w:r>
-          </w:p>
-          <w:p>
-            <w:pPr>
-              <w:widowControl w:val="0"/>
-              <w:autoSpaceDE w:val="0"/>
-              <w:autoSpaceDN w:val="0"/>
-              <w:adjustRightInd w:val="0"/>
-              <w:spacing w:before="0" w:line="240" w:lineRule="auto"/>
-              <w:rPr>
                 <w:rFonts w:cs="BRH Malayalam Extra"/>
                 <w:color w:val="FF0000"/>
                 <w:szCs w:val="40"/>
@@ -8945,7 +9189,7 @@
       </w:tr>
       <w:tr>
         <w:trPr>
-          <w:trHeight w:val="2249"/>
+          <w:trHeight w:val="1793"/>
         </w:trPr>
         <w:tc>
           <w:tcPr>
@@ -8977,7 +9221,6 @@
                 <w:color w:val="000000"/>
                 <w:szCs w:val="32"/>
               </w:rPr>
-              <w:lastRenderedPageBreak/>
               <w:t>13</w:t>
             </w:r>
             <w:r>
@@ -9829,6 +10072,7 @@
                 <w:color w:val="000000"/>
                 <w:szCs w:val="32"/>
               </w:rPr>
+              <w:lastRenderedPageBreak/>
               <w:t>15</w:t>
             </w:r>
             <w:r>
@@ -10414,6 +10658,7 @@
                 <w:color w:val="000000"/>
                 <w:szCs w:val="32"/>
               </w:rPr>
+              <w:lastRenderedPageBreak/>
               <w:t>13</w:t>
             </w:r>
             <w:r>
@@ -11383,6 +11628,7 @@
                 <w:color w:val="000000"/>
                 <w:szCs w:val="32"/>
               </w:rPr>
+              <w:lastRenderedPageBreak/>
               <w:t>15</w:t>
             </w:r>
             <w:r>
@@ -15044,6 +15290,7 @@
                 <w:color w:val="000000"/>
                 <w:szCs w:val="32"/>
               </w:rPr>
+              <w:lastRenderedPageBreak/>
               <w:t>22</w:t>
             </w:r>
             <w:r>
@@ -15944,7 +16191,7 @@
       </w:tr>
       <w:tr>
         <w:trPr>
-          <w:trHeight w:val="1183"/>
+          <w:trHeight w:val="659"/>
         </w:trPr>
         <w:tc>
           <w:tcPr>
@@ -15976,7 +16223,6 @@
                 <w:color w:val="000000"/>
                 <w:szCs w:val="32"/>
               </w:rPr>
-              <w:lastRenderedPageBreak/>
               <w:t>28</w:t>
             </w:r>
             <w:r>
@@ -18002,6 +18248,7 @@
                 <w:sz w:val="32"/>
                 <w:szCs w:val="32"/>
               </w:rPr>
+              <w:lastRenderedPageBreak/>
               <w:t>k¡</w:t>
             </w:r>
             <w:r>
@@ -18162,6 +18409,7 @@
                 <w:color w:val="000000"/>
                 <w:szCs w:val="32"/>
               </w:rPr>
+              <w:lastRenderedPageBreak/>
               <w:t>28</w:t>
             </w:r>
             <w:r>
@@ -20013,6 +20261,7 @@
                 <w:sz w:val="32"/>
                 <w:szCs w:val="32"/>
               </w:rPr>
+              <w:lastRenderedPageBreak/>
               <w:t>k¡</w:t>
             </w:r>
             <w:r>
@@ -22832,32 +23081,6 @@
         </w:rPr>
         <w:t>===========</w:t>
       </w:r>
-    </w:p>
-    <w:p>
-      <w:pPr>
-        <w:spacing w:before="0" w:line="240" w:lineRule="auto"/>
-        <w:jc w:val="center"/>
-        <w:rPr>
-          <w:b/>
-          <w:bCs/>
-          <w:sz w:val="32"/>
-          <w:szCs w:val="32"/>
-          <w:u w:val="single"/>
-        </w:rPr>
-      </w:pPr>
-    </w:p>
-    <w:p>
-      <w:pPr>
-        <w:spacing w:before="0" w:line="240" w:lineRule="auto"/>
-        <w:jc w:val="center"/>
-        <w:rPr>
-          <w:b/>
-          <w:bCs/>
-          <w:sz w:val="32"/>
-          <w:szCs w:val="32"/>
-          <w:u w:val="single"/>
-        </w:rPr>
-      </w:pPr>
     </w:p>
     <w:p>
       <w:pPr>

</xml_diff>